<commit_message>
build(paper): regenera entregables y agrega formateador C&G
- Agrega scripts/40_formatear_docx_cageo.py para el post-procesado
  editorial: TNR 12 pt, interlineado doble, numeracion de lineas,
  tablas de tres lineas con encabezado repetido y figuras a 600 dpi.
- Regenera manuscrito y material derivado en DOCX, HTML y PDF.
- Actualiza figuras y los scripts que las generan.
- Publica cover letter, highlights y title page coherentes con el
  manuscrito corregido.
</commit_message>
<xml_diff>
--- a/entregables/cover_letter.docx
+++ b/entregables/cover_letter.docx
@@ -15,7 +15,7 @@
         <w:pStyle w:val="Date"/>
       </w:pPr>
       <w:r>
-        <w:t xml:space="preserve">2026-10-27</w:t>
+        <w:t xml:space="preserve">2026-10-28</w:t>
       </w:r>
     </w:p>
     <w:p>
@@ -33,7 +33,7 @@
         <w:t xml:space="preserve"> </w:t>
       </w:r>
       <w:r>
-        <w:t xml:space="preserve">October 27, 2026</w:t>
+        <w:t xml:space="preserve">October 28, 2026</w:t>
       </w:r>
     </w:p>
     <w:p>
@@ -224,21 +224,7 @@
         <w:t xml:space="preserve"> </w:t>
       </w:r>
       <w:r>
-        <w:t xml:space="preserve">Widely deployed operational frameworks—such as the Canadian Forest Fire Weather Index (FWI) used by EFFIS/GWIS and the CPTEC/INPE Risco de Fogo—consistently fail or invert hazard rankings in water-limited subtropical biomes (e.g., the South American Gran Chaco), where vapor pressure deficit (</w:t>
-      </w:r>
-      <m:oMath>
-        <m:r>
-          <m:t>V</m:t>
-        </m:r>
-        <m:r>
-          <m:t>P</m:t>
-        </m:r>
-        <m:r>
-          <m:t>D</m:t>
-        </m:r>
-      </m:oMath>
-      <w:r>
-        <w:t xml:space="preserve">) and non-linear fuel-curing dynamics govern fire risk.</w:t>
+        <w:t xml:space="preserve">Widely deployed operational frameworks—such as the Canadian Forest Fire Weather Index (FWI) used by EFFIS/GWIS and the CPTEC/INPE Risco de Fogo—consistently fail or invert hazard rankings in water-limited subtropical biomes (e.g., the South American Gran Chaco), where vapor pressure deficit (VPD) and non-linear fuel-curing dynamics govern fire risk.</w:t>
       </w:r>
     </w:p>
     <w:p>
@@ -258,66 +244,17 @@
         <w:t xml:space="preserve">Incendios_PY</w:t>
       </w:r>
       <w:r>
-        <w:t xml:space="preserve">, an open-source computational framework for reproducible decoupled wildfire modelling across</w:t>
-      </w:r>
-      <w:r>
-        <w:t xml:space="preserve"> </w:t>
-      </w:r>
-      <m:oMath>
-        <m:r>
-          <m:t>400</m:t>
-        </m:r>
-        <m:r>
-          <m:rPr>
-            <m:sty m:val="p"/>
-          </m:rPr>
-          <m:t>,</m:t>
-        </m:r>
-        <m:r>
-          <m:t>006</m:t>
-        </m:r>
-      </m:oMath>
-      <w:r>
-        <w:rPr>
-          <w:b/>
-          <w:bCs/>
-        </w:rPr>
-        <w:t xml:space="preserve"> </w:t>
-      </w:r>
-      <m:oMath>
-        <m:r>
-          <m:t>1</m:t>
-        </m:r>
-        <m:sSup>
-          <m:e>
-            <m:r>
-              <m:rPr>
-                <m:nor/>
-                <m:sty m:val="p"/>
-              </m:rPr>
-              <m:t>-km</m:t>
-            </m:r>
-          </m:e>
-          <m:sup>
-            <m:r>
-              <m:t>2</m:t>
-            </m:r>
-          </m:sup>
-        </m:sSup>
-      </m:oMath>
-      <w:r>
-        <w:rPr>
-          <w:b/>
-          <w:bCs/>
-        </w:rPr>
-        <w:t xml:space="preserve"> </w:t>
-      </w:r>
-      <w:r>
-        <w:rPr>
-          <w:b/>
-          <w:bCs/>
-        </w:rPr>
-        <w:t xml:space="preserve">grid cells</w:t>
+        <w:t xml:space="preserve">, an open-source computational framework for reproducible decoupled wildfire modeling across</w:t>
+      </w:r>
+      <w:r>
+        <w:t xml:space="preserve"> </w:t>
+      </w:r>
+      <w:r>
+        <w:rPr>
+          <w:b/>
+          <w:bCs/>
+        </w:rPr>
+        <w:t xml:space="preserve">400 006 1-km² grid cells</w:t>
       </w:r>
       <w:r>
         <w:t xml:space="preserve"> </w:t>
@@ -339,28 +276,7 @@
         <w:t xml:space="preserve"> </w:t>
       </w:r>
       <w:r>
-        <w:t xml:space="preserve">(</w:t>
-      </w:r>
-      <m:oMath>
-        <m:sSub>
-          <m:e>
-            <m:r>
-              <m:rPr>
-                <m:scr m:val="script"/>
-                <m:sty m:val="p"/>
-              </m:rPr>
-              <m:t>M</m:t>
-            </m:r>
-          </m:e>
-          <m:sub>
-            <m:r>
-              <m:t>3</m:t>
-            </m:r>
-          </m:sub>
-        </m:sSub>
-      </m:oMath>
-      <w:r>
-        <w:t xml:space="preserve">), guided by physics-based monotonic constraints, ecotone edge gradients, and static anthropogenic priors at 10-km and 25-km scales; and (ii)</w:t>
+        <w:t xml:space="preserve">(M3), guided by physics-based monotonic constraints, ecotone edge gradients, and static anthropogenic priors at 10-km and 25-km scales; and (ii)</w:t>
       </w:r>
       <w:r>
         <w:t xml:space="preserve"> </w:t>
@@ -373,27 +289,7 @@
         <w:t xml:space="preserve">Tactical Propagation</w:t>
       </w:r>
       <w:r>
-        <w:t xml:space="preserve">, driven by a causal spatial contagion kernel at lag</w:t>
-      </w:r>
-      <w:r>
-        <w:t xml:space="preserve"> </w:t>
-      </w:r>
-      <m:oMath>
-        <m:r>
-          <m:t>t</m:t>
-        </m:r>
-        <m:r>
-          <m:rPr>
-            <m:sty m:val="p"/>
-          </m:rPr>
-          <m:t>−</m:t>
-        </m:r>
-        <m:r>
-          <m:t>1</m:t>
-        </m:r>
-      </m:oMath>
-      <w:r>
-        <w:t xml:space="preserve">.</w:t>
+        <w:t xml:space="preserve">, driven by a causal spatial contagion kernel at lag t−1.</w:t>
       </w:r>
     </w:p>
     <w:bookmarkEnd w:id="9"/>
@@ -472,93 +368,23 @@
         <w:t xml:space="preserve"> </w:t>
       </w:r>
       <w:r>
-        <w:t xml:space="preserve">By integrating Apache Arrow, DuckDB, and Polars, our inference engine processes the entire national territory (</w:t>
-      </w:r>
-      <m:oMath>
-        <m:r>
-          <m:t>400</m:t>
-        </m:r>
-        <m:r>
-          <m:rPr>
-            <m:sty m:val="p"/>
-          </m:rPr>
-          <m:t>,</m:t>
-        </m:r>
-        <m:r>
-          <m:t>006</m:t>
-        </m:r>
-        <m:sSup>
-          <m:e>
-            <m:r>
-              <m:rPr>
-                <m:nor/>
-                <m:sty m:val="p"/>
-              </m:rPr>
-              <m:t> km</m:t>
-            </m:r>
-          </m:e>
-          <m:sup>
-            <m:r>
-              <m:t>2</m:t>
-            </m:r>
-          </m:sup>
-        </m:sSup>
-      </m:oMath>
-      <w:r>
-        <w:t xml:space="preserve">) in</w:t>
-      </w:r>
-      <w:r>
-        <w:t xml:space="preserve"> </w:t>
-      </w:r>
-      <w:r>
-        <w:rPr>
-          <w:b/>
-          <w:bCs/>
-        </w:rPr>
-        <w:t xml:space="preserve">~</w:t>
-      </w:r>
-      <m:oMath>
-        <m:r>
-          <m:t>3.47</m:t>
-        </m:r>
-      </m:oMath>
-      <w:r>
-        <w:rPr>
-          <w:b/>
-          <w:bCs/>
-        </w:rPr>
-        <w:t xml:space="preserve"> </w:t>
-      </w:r>
-      <w:r>
-        <w:rPr>
-          <w:b/>
-          <w:bCs/>
-        </w:rPr>
-        <w:t xml:space="preserve">seconds</w:t>
-      </w:r>
-      <w:r>
-        <w:t xml:space="preserve"> </w:t>
-      </w:r>
-      <w:r>
-        <w:t xml:space="preserve">on a standard ARM64 machine (~</w:t>
-      </w:r>
-      <m:oMath>
-        <m:r>
-          <m:t>2.21</m:t>
-        </m:r>
-        <m:r>
-          <m:rPr>
-            <m:nor/>
-            <m:sty m:val="p"/>
-          </m:rPr>
-          <m:t> GB</m:t>
-        </m:r>
-      </m:oMath>
-      <w:r>
-        <w:t xml:space="preserve"> </w:t>
-      </w:r>
-      <w:r>
-        <w:t xml:space="preserve">peak RAM), demonstrating that national early-warning systems do not require prohibitive cloud infrastructure.</w:t>
+        <w:t xml:space="preserve">By integrating Apache Arrow, DuckDB, and Polars, our inference engine processes the entire national territory (400 006 km²) in</w:t>
+      </w:r>
+      <w:r>
+        <w:t xml:space="preserve"> </w:t>
+      </w:r>
+      <w:r>
+        <w:rPr>
+          <w:b/>
+          <w:bCs/>
+        </w:rPr>
+        <w:t xml:space="preserve">~3.47 seconds</w:t>
+      </w:r>
+      <w:r>
+        <w:t xml:space="preserve"> </w:t>
+      </w:r>
+      <w:r>
+        <w:t xml:space="preserve">on a standard ARM64 machine (~2.21 GB peak RAM), demonstrating that national early-warning systems do not require prohibitive cloud infrastructure.</w:t>
       </w:r>
     </w:p>
     <w:p>
@@ -580,44 +406,7 @@
         <w:t xml:space="preserve"> </w:t>
       </w:r>
       <w:r>
-        <w:t xml:space="preserve">We enforce structural monotonic constraints within LightGBM (</w:t>
-      </w:r>
-      <m:oMath>
-        <m:r>
-          <m:rPr>
-            <m:sty m:val="p"/>
-          </m:rPr>
-          <m:t>+</m:t>
-        </m:r>
-        <m:r>
-          <m:t>1</m:t>
-        </m:r>
-      </m:oMath>
-      <w:r>
-        <w:t xml:space="preserve"> </w:t>
-      </w:r>
-      <w:r>
-        <w:t xml:space="preserve">for atmospheric dryness and wind pressure,</w:t>
-      </w:r>
-      <w:r>
-        <w:t xml:space="preserve"> </w:t>
-      </w:r>
-      <m:oMath>
-        <m:r>
-          <m:rPr>
-            <m:sty m:val="p"/>
-          </m:rPr>
-          <m:t>−</m:t>
-        </m:r>
-        <m:r>
-          <m:t>1</m:t>
-        </m:r>
-      </m:oMath>
-      <w:r>
-        <w:t xml:space="preserve"> </w:t>
-      </w:r>
-      <w:r>
-        <w:t xml:space="preserve">for antecedent rainfall and distance), mathematically preventing counterintuitive artifacts.</w:t>
+        <w:t xml:space="preserve">We enforce structural monotonic constraints within LightGBM (+1 for atmospheric dryness and wind pressure, −1 for antecedent rainfall and distance), mathematically preventing counterintuitive artifacts.</w:t>
       </w:r>
     </w:p>
     <w:p>
@@ -715,31 +504,7 @@
         <w:t xml:space="preserve">tests/</w:t>
       </w:r>
       <w:r>
-        <w:t xml:space="preserve">) running in</w:t>
-      </w:r>
-      <w:r>
-        <w:t xml:space="preserve"> </w:t>
-      </w:r>
-      <m:oMath>
-        <m:r>
-          <m:rPr>
-            <m:sty m:val="p"/>
-          </m:rPr>
-          <m:t>≈</m:t>
-        </m:r>
-        <m:r>
-          <m:t>1</m:t>
-        </m:r>
-        <m:r>
-          <m:rPr>
-            <m:nor/>
-            <m:sty m:val="p"/>
-          </m:rPr>
-          <m:t> minute</m:t>
-        </m:r>
-      </m:oMath>
-      <w:r>
-        <w:t xml:space="preserve">, verifying algebraic invariants, physical monotonicity, conformal coverage, and spatial KD-Tree queries. All code and workflows are versioned from raw ingestion (</w:t>
+        <w:t xml:space="preserve">) running in ≈1 minute, verifying algebraic invariants, physical monotonicity, conformal coverage, and spatial KD-Tree queries. All code and workflows are versioned from raw ingestion (</w:t>
       </w:r>
       <w:r>
         <w:rPr>
@@ -779,75 +544,18 @@
         <w:t xml:space="preserve"> </w:t>
       </w:r>
       <w:r>
-        <w:t xml:space="preserve">In retrospective temporal testing over</w:t>
-      </w:r>
-      <w:r>
-        <w:t xml:space="preserve"> </w:t>
-      </w:r>
-      <m:oMath>
-        <m:r>
-          <m:t>1</m:t>
-        </m:r>
-        <m:r>
-          <m:rPr>
-            <m:sty m:val="p"/>
-          </m:rPr>
-          <m:t>,</m:t>
-        </m:r>
-        <m:r>
-          <m:t>813</m:t>
-        </m:r>
-        <m:r>
-          <m:rPr>
-            <m:sty m:val="p"/>
-          </m:rPr>
-          <m:t>,</m:t>
-        </m:r>
-        <m:r>
-          <m:t>966</m:t>
-        </m:r>
-      </m:oMath>
-      <w:r>
-        <w:t xml:space="preserve"> </w:t>
-      </w:r>
-      <w:r>
-        <w:t xml:space="preserve">D2 cell-days during 2024–2025, our hybrid ignition layer</w:t>
-      </w:r>
-      <w:r>
-        <w:t xml:space="preserve"> </w:t>
-      </w:r>
-      <m:oMath>
-        <m:sSub>
-          <m:e>
-            <m:r>
-              <m:rPr>
-                <m:scr m:val="script"/>
-                <m:sty m:val="p"/>
-              </m:rPr>
-              <m:t>M</m:t>
-            </m:r>
-          </m:e>
-          <m:sub>
-            <m:r>
-              <m:t>3</m:t>
-            </m:r>
-          </m:sub>
-        </m:sSub>
-      </m:oMath>
-      <w:r>
-        <w:t xml:space="preserve"> </w:t>
-      </w:r>
-      <w:r>
-        <w:t xml:space="preserve">achieves a ROC-AUC of</w:t>
-      </w:r>
-      <w:r>
-        <w:t xml:space="preserve"> </w:t>
-      </w:r>
-      <m:oMath>
-        <m:r>
-          <m:t>0.8021</m:t>
-        </m:r>
-      </m:oMath>
+        <w:t xml:space="preserve">In retrospective temporal testing over 1 813 966 D2 cell-days during 2024–2025, our hybrid ignition layer M3 achieves a ROC-AUC of</w:t>
+      </w:r>
+      <w:r>
+        <w:t xml:space="preserve"> </w:t>
+      </w:r>
+      <w:r>
+        <w:rPr>
+          <w:b/>
+          <w:bCs/>
+        </w:rPr>
+        <w:t xml:space="preserve">0.8021</w:t>
+      </w:r>
       <w:r>
         <w:t xml:space="preserve"> </w:t>
       </w:r>
@@ -857,11 +565,13 @@
       <w:r>
         <w:t xml:space="preserve"> </w:t>
       </w:r>
-      <m:oMath>
-        <m:r>
-          <m:t>0.7534</m:t>
-        </m:r>
-      </m:oMath>
+      <w:r>
+        <w:rPr>
+          <w:b/>
+          <w:bCs/>
+        </w:rPr>
+        <w:t xml:space="preserve">0.7534</w:t>
+      </w:r>
       <w:r>
         <w:t xml:space="preserve"> </w:t>
       </w:r>
@@ -871,37 +581,13 @@
       <w:r>
         <w:t xml:space="preserve"> </w:t>
       </w:r>
-      <m:oMath>
-        <m:r>
-          <m:t>0.5173</m:t>
-        </m:r>
-      </m:oMath>
-      <w:r>
-        <w:rPr>
-          <w:b/>
-          <w:bCs/>
-        </w:rPr>
-        <w:t xml:space="preserve"> </w:t>
-      </w:r>
-      <w:r>
-        <w:rPr>
-          <w:b/>
-          <w:bCs/>
-        </w:rPr>
-        <w:t xml:space="preserve">/</w:t>
-      </w:r>
-      <w:r>
-        <w:rPr>
-          <w:b/>
-          <w:bCs/>
-        </w:rPr>
-        <w:t xml:space="preserve"> </w:t>
-      </w:r>
-      <m:oMath>
-        <m:r>
-          <m:t>0.5564</m:t>
-        </m:r>
-      </m:oMath>
+      <w:r>
+        <w:rPr>
+          <w:b/>
+          <w:bCs/>
+        </w:rPr>
+        <w:t xml:space="preserve">0.5173 / 0.5564</w:t>
+      </w:r>
       <w:r>
         <w:t xml:space="preserve"> </w:t>
       </w:r>
@@ -911,175 +597,34 @@
       <w:r>
         <w:t xml:space="preserve"> </w:t>
       </w:r>
-      <m:oMath>
-        <m:r>
-          <m:t>0.5389</m:t>
-        </m:r>
-      </m:oMath>
-      <w:r>
-        <w:rPr>
-          <w:b/>
-          <w:bCs/>
-        </w:rPr>
-        <w:t xml:space="preserve"> </w:t>
-      </w:r>
-      <w:r>
-        <w:rPr>
-          <w:b/>
-          <w:bCs/>
-        </w:rPr>
-        <w:t xml:space="preserve">/</w:t>
-      </w:r>
-      <w:r>
-        <w:rPr>
-          <w:b/>
-          <w:bCs/>
-        </w:rPr>
-        <w:t xml:space="preserve"> </w:t>
-      </w:r>
-      <m:oMath>
-        <m:r>
-          <m:t>0.4990</m:t>
-        </m:r>
-      </m:oMath>
-      <w:r>
-        <w:t xml:space="preserve"> </w:t>
-      </w:r>
-      <w:r>
-        <w:t xml:space="preserve">for the INPE. Case-control</w:t>
-      </w:r>
-      <w:r>
-        <w:t xml:space="preserve"> </w:t>
-      </w:r>
-      <m:oMath>
-        <m:sSub>
-          <m:e>
-            <m:r>
-              <m:t>F</m:t>
-            </m:r>
-          </m:e>
-          <m:sub>
-            <m:r>
-              <m:t>0.5</m:t>
-            </m:r>
-          </m:sub>
-        </m:sSub>
-      </m:oMath>
-      <w:r>
-        <w:t xml:space="preserve"> </w:t>
-      </w:r>
-      <w:r>
-        <w:t xml:space="preserve">precision is</w:t>
-      </w:r>
-      <w:r>
-        <w:t xml:space="preserve"> </w:t>
-      </w:r>
-      <m:oMath>
-        <m:r>
-          <m:t>32.82</m:t>
-        </m:r>
-        <m:r>
-          <m:rPr>
-            <m:nor/>
-            <m:sty m:val="p"/>
-          </m:rPr>
-          <m:t> %</m:t>
-        </m:r>
-      </m:oMath>
-      <w:r>
-        <w:t xml:space="preserve"> </w:t>
-      </w:r>
-      <w:r>
-        <w:t xml:space="preserve">/</w:t>
-      </w:r>
-      <w:r>
-        <w:t xml:space="preserve"> </w:t>
-      </w:r>
-      <m:oMath>
-        <m:r>
-          <m:t>30.13</m:t>
-        </m:r>
-        <m:r>
-          <m:rPr>
-            <m:nor/>
-            <m:sty m:val="p"/>
-          </m:rPr>
-          <m:t> %</m:t>
-        </m:r>
-      </m:oMath>
-      <w:r>
-        <w:t xml:space="preserve">; after correction to population prevalence (~0.015 % / 0.041 %), operational precision is</w:t>
-      </w:r>
-      <w:r>
-        <w:t xml:space="preserve"> </w:t>
-      </w:r>
-      <m:oMath>
-        <m:r>
-          <m:t>0.082</m:t>
-        </m:r>
-        <m:r>
-          <m:rPr>
-            <m:nor/>
-            <m:sty m:val="p"/>
-          </m:rPr>
-          <m:t> %</m:t>
-        </m:r>
-      </m:oMath>
-      <w:r>
-        <w:t xml:space="preserve"> </w:t>
-      </w:r>
-      <w:r>
-        <w:t xml:space="preserve">/</w:t>
-      </w:r>
-      <w:r>
-        <w:t xml:space="preserve"> </w:t>
-      </w:r>
-      <m:oMath>
-        <m:r>
-          <m:t>0.198</m:t>
-        </m:r>
-        <m:r>
-          <m:rPr>
-            <m:nor/>
-            <m:sty m:val="p"/>
-          </m:rPr>
-          <m:t> %</m:t>
-        </m:r>
-      </m:oMath>
-      <w:r>
-        <w:t xml:space="preserve">. Tactical propagation achieves ROC-AUC</w:t>
-      </w:r>
-      <w:r>
-        <w:t xml:space="preserve"> </w:t>
-      </w:r>
-      <m:oMath>
-        <m:r>
-          <m:t>0.9039</m:t>
-        </m:r>
-      </m:oMath>
-      <w:r>
-        <w:t xml:space="preserve"> </w:t>
-      </w:r>
-      <w:r>
-        <w:t xml:space="preserve">(Chaco) and population precision</w:t>
-      </w:r>
-      <w:r>
-        <w:t xml:space="preserve"> </w:t>
-      </w:r>
-      <m:oMath>
-        <m:r>
-          <m:t>9.67</m:t>
-        </m:r>
-        <m:r>
-          <m:rPr>
-            <m:nor/>
-            <m:sty m:val="p"/>
-          </m:rPr>
-          <m:t> %</m:t>
-        </m:r>
-      </m:oMath>
-      <w:r>
-        <w:t xml:space="preserve">. The 2023 validation selected M3 for temporal nowcasting and M2 as the operational fallback; M1 was rejected as a fallback. These corrected metrics are the honest operational benchmark.</w:t>
+      <w:r>
+        <w:rPr>
+          <w:b/>
+          <w:bCs/>
+        </w:rPr>
+        <w:t xml:space="preserve">0.5389 / 0.4990</w:t>
+      </w:r>
+      <w:r>
+        <w:t xml:space="preserve"> </w:t>
+      </w:r>
+      <w:r>
+        <w:t xml:space="preserve">for the INPE. Case-control F0.5 precision is 32.82 % / 30.13 %; after correction to population prevalence (~0.015 % / 0.041 %), operational precision is 0.082 % / 0.198 %. Tactical propagation achieves ROC-AUC</w:t>
+      </w:r>
+      <w:r>
+        <w:t xml:space="preserve"> </w:t>
+      </w:r>
+      <w:r>
+        <w:rPr>
+          <w:b/>
+          <w:bCs/>
+        </w:rPr>
+        <w:t xml:space="preserve">0.9039</w:t>
+      </w:r>
+      <w:r>
+        <w:t xml:space="preserve"> </w:t>
+      </w:r>
+      <w:r>
+        <w:t xml:space="preserve">(Chaco) and population precision 9.67 %. The 2023 validation selected M3 for temporal nowcasting and M2 as the operational fallback; M1 was rejected as a fallback. These corrected metrics are the honest operational benchmark.</w:t>
       </w:r>
     </w:p>
     <w:bookmarkEnd w:id="10"/>
@@ -1134,7 +679,7 @@
         <w:t xml:space="preserve">fuentes/MANIFIESTO_DATOS_v3.csv</w:t>
       </w:r>
       <w:r>
-        <w:t xml:space="preserve">, available in the v2.0.0 GitHub release, and indexed by the code and data concept DOIs (10.5281/zenodo.23675104; 10.5281/zenodo.23675278).</w:t>
+        <w:t xml:space="preserve">, available in the v2.0.1 GitHub release, and indexed by the code and data concept DOIs (10.5281/zenodo.23675104; 10.5281/zenodo.23675278).</w:t>
       </w:r>
     </w:p>
     <w:p>
@@ -1219,6 +764,12 @@
           <w:rStyle w:val="VerbatimChar"/>
         </w:rPr>
         <w:t xml:space="preserve">sanchez.martin093@gmail.com</w:t>
+      </w:r>
+      <w:r>
+        <w:br/>
+      </w:r>
+      <w:r>
+        <w:t xml:space="preserve">Phone: +595 971 907 727</w:t>
       </w:r>
       <w:r>
         <w:br/>

</xml_diff>

<commit_message>
release: cierra manuscrito v2.1.0 y auditoría de envío
</commit_message>
<xml_diff>
--- a/entregables/cover_letter.docx
+++ b/entregables/cover_letter.docx
@@ -7,6 +7,10 @@
         <w:pStyle w:val="Title"/>
       </w:pPr>
       <w:r>
+        <w:rPr>
+          <w:rFonts w:ascii="Times New Roman" w:hAnsi="Times New Roman" w:cs="Times New Roman" w:eastAsia="Times New Roman"/>
+          <w:sz w:val="28"/>
+        </w:rPr>
         <w:t xml:space="preserve">Cover Letter to the Editor-in-Chief</w:t>
       </w:r>
     </w:p>
@@ -15,85 +19,142 @@
         <w:pStyle w:val="Date"/>
       </w:pPr>
       <w:r>
+        <w:rPr>
+          <w:rFonts w:ascii="Times New Roman" w:hAnsi="Times New Roman" w:cs="Times New Roman" w:eastAsia="Times New Roman"/>
+          <w:sz w:val="20"/>
+        </w:rPr>
         <w:t xml:space="preserve">2026-10-28</w:t>
       </w:r>
     </w:p>
     <w:p>
       <w:pPr>
         <w:pStyle w:val="FirstParagraph"/>
-      </w:pPr>
-      <w:r>
-        <w:rPr>
+        <w:spacing w:line="480" w:lineRule="auto"/>
+      </w:pPr>
+      <w:r>
+        <w:rPr>
+          <w:rFonts w:ascii="Times New Roman" w:hAnsi="Times New Roman" w:cs="Times New Roman" w:eastAsia="Times New Roman"/>
           <w:b/>
           <w:bCs/>
+          <w:sz w:val="20"/>
         </w:rPr>
         <w:t xml:space="preserve">Date:</w:t>
       </w:r>
       <w:r>
-        <w:t xml:space="preserve"> </w:t>
-      </w:r>
-      <w:r>
+        <w:rPr>
+          <w:rFonts w:ascii="Times New Roman" w:hAnsi="Times New Roman" w:cs="Times New Roman" w:eastAsia="Times New Roman"/>
+          <w:sz w:val="20"/>
+        </w:rPr>
+        <w:t xml:space="preserve"> </w:t>
+      </w:r>
+      <w:r>
+        <w:rPr>
+          <w:rFonts w:ascii="Times New Roman" w:hAnsi="Times New Roman" w:cs="Times New Roman" w:eastAsia="Times New Roman"/>
+          <w:sz w:val="20"/>
+        </w:rPr>
         <w:t xml:space="preserve">October 28, 2026</w:t>
       </w:r>
     </w:p>
     <w:p>
       <w:pPr>
         <w:pStyle w:val="BodyText"/>
-      </w:pPr>
-      <w:r>
-        <w:rPr>
+        <w:spacing w:line="480" w:lineRule="auto"/>
+      </w:pPr>
+      <w:r>
+        <w:rPr>
+          <w:rFonts w:ascii="Times New Roman" w:hAnsi="Times New Roman" w:cs="Times New Roman" w:eastAsia="Times New Roman"/>
           <w:b/>
           <w:bCs/>
+          <w:sz w:val="20"/>
         </w:rPr>
         <w:t xml:space="preserve">To:</w:t>
       </w:r>
       <w:r>
+        <w:rPr>
+          <w:rFonts w:ascii="Times New Roman" w:hAnsi="Times New Roman" w:cs="Times New Roman" w:eastAsia="Times New Roman"/>
+          <w:sz w:val="20"/>
+        </w:rPr>
         <w:br/>
       </w:r>
       <w:r>
+        <w:rPr>
+          <w:rFonts w:ascii="Times New Roman" w:hAnsi="Times New Roman" w:cs="Times New Roman" w:eastAsia="Times New Roman"/>
+          <w:sz w:val="20"/>
+        </w:rPr>
         <w:t xml:space="preserve">The Editors-in-Chief</w:t>
       </w:r>
       <w:r>
+        <w:rPr>
+          <w:rFonts w:ascii="Times New Roman" w:hAnsi="Times New Roman" w:cs="Times New Roman" w:eastAsia="Times New Roman"/>
+          <w:sz w:val="20"/>
+        </w:rPr>
         <w:br/>
       </w:r>
       <w:r>
         <w:rPr>
+          <w:rFonts w:ascii="Times New Roman" w:hAnsi="Times New Roman" w:cs="Times New Roman" w:eastAsia="Times New Roman"/>
           <w:i/>
           <w:iCs/>
+          <w:sz w:val="20"/>
         </w:rPr>
         <w:t xml:space="preserve">Computers &amp; Geosciences</w:t>
       </w:r>
       <w:r>
+        <w:rPr>
+          <w:rFonts w:ascii="Times New Roman" w:hAnsi="Times New Roman" w:cs="Times New Roman" w:eastAsia="Times New Roman"/>
+          <w:sz w:val="20"/>
+        </w:rPr>
         <w:br/>
       </w:r>
       <w:r>
+        <w:rPr>
+          <w:rFonts w:ascii="Times New Roman" w:hAnsi="Times New Roman" w:cs="Times New Roman" w:eastAsia="Times New Roman"/>
+          <w:sz w:val="20"/>
+        </w:rPr>
         <w:t xml:space="preserve">Elsevier Science</w:t>
       </w:r>
     </w:p>
     <w:p>
       <w:pPr>
         <w:pStyle w:val="BodyText"/>
-      </w:pPr>
-      <w:r>
-        <w:rPr>
+        <w:spacing w:line="480" w:lineRule="auto"/>
+      </w:pPr>
+      <w:r>
+        <w:rPr>
+          <w:rFonts w:ascii="Times New Roman" w:hAnsi="Times New Roman" w:cs="Times New Roman" w:eastAsia="Times New Roman"/>
           <w:b/>
           <w:bCs/>
+          <w:sz w:val="20"/>
         </w:rPr>
         <w:t xml:space="preserve">Subject:</w:t>
       </w:r>
       <w:r>
-        <w:t xml:space="preserve"> </w:t>
-      </w:r>
-      <w:r>
+        <w:rPr>
+          <w:rFonts w:ascii="Times New Roman" w:hAnsi="Times New Roman" w:cs="Times New Roman" w:eastAsia="Times New Roman"/>
+          <w:sz w:val="20"/>
+        </w:rPr>
+        <w:t xml:space="preserve"> </w:t>
+      </w:r>
+      <w:r>
+        <w:rPr>
+          <w:rFonts w:ascii="Times New Roman" w:hAnsi="Times New Roman" w:cs="Times New Roman" w:eastAsia="Times New Roman"/>
+          <w:sz w:val="20"/>
+        </w:rPr>
         <w:t xml:space="preserve">Submission of original research paper titled</w:t>
       </w:r>
       <w:r>
-        <w:t xml:space="preserve"> </w:t>
-      </w:r>
-      <w:r>
-        <w:rPr>
+        <w:rPr>
+          <w:rFonts w:ascii="Times New Roman" w:hAnsi="Times New Roman" w:cs="Times New Roman" w:eastAsia="Times New Roman"/>
+          <w:sz w:val="20"/>
+        </w:rPr>
+        <w:t xml:space="preserve"> </w:t>
+      </w:r>
+      <w:r>
+        <w:rPr>
+          <w:rFonts w:ascii="Times New Roman" w:hAnsi="Times New Roman" w:cs="Times New Roman" w:eastAsia="Times New Roman"/>
           <w:i/>
           <w:iCs/>
+          <w:sz w:val="20"/>
         </w:rPr>
         <w:t xml:space="preserve">“A Reproducible Computational Framework for Decoupled Wildfire Ignition and Propagation Benchmarking in the Gran Chaco (2018–2025)”</w:t>
       </w:r>
@@ -101,59 +162,116 @@
     <w:p>
       <w:pPr>
         <w:pStyle w:val="BodyText"/>
-      </w:pPr>
-      <w:r>
+        <w:spacing w:line="480" w:lineRule="auto"/>
+      </w:pPr>
+      <w:r>
+        <w:rPr>
+          <w:rFonts w:ascii="Times New Roman" w:hAnsi="Times New Roman" w:cs="Times New Roman" w:eastAsia="Times New Roman"/>
+          <w:sz w:val="20"/>
+        </w:rPr>
         <w:t xml:space="preserve">Dear Editors-in-Chief,</w:t>
       </w:r>
     </w:p>
     <w:p>
       <w:pPr>
         <w:pStyle w:val="BodyText"/>
-      </w:pPr>
-      <w:r>
-        <w:t xml:space="preserve">Please find enclosed our original research manuscript entitled</w:t>
-      </w:r>
-      <w:r>
-        <w:t xml:space="preserve"> </w:t>
-      </w:r>
-      <w:r>
-        <w:rPr>
+        <w:spacing w:line="480" w:lineRule="auto"/>
+      </w:pPr>
+      <w:r>
+        <w:rPr>
+          <w:rFonts w:ascii="Times New Roman" w:hAnsi="Times New Roman" w:cs="Times New Roman" w:eastAsia="Times New Roman"/>
+          <w:sz w:val="20"/>
+        </w:rPr>
+        <w:t xml:space="preserve">Please find enclosed my original research manuscript entitled</w:t>
+      </w:r>
+      <w:r>
+        <w:rPr>
+          <w:rFonts w:ascii="Times New Roman" w:hAnsi="Times New Roman" w:cs="Times New Roman" w:eastAsia="Times New Roman"/>
+          <w:sz w:val="20"/>
+        </w:rPr>
+        <w:t xml:space="preserve"> </w:t>
+      </w:r>
+      <w:r>
+        <w:rPr>
+          <w:rFonts w:ascii="Times New Roman" w:hAnsi="Times New Roman" w:cs="Times New Roman" w:eastAsia="Times New Roman"/>
           <w:b/>
           <w:bCs/>
+          <w:sz w:val="20"/>
         </w:rPr>
         <w:t xml:space="preserve">“A Reproducible Computational Framework for Decoupled Wildfire Ignition and Propagation Benchmarking in the Gran Chaco (2018–2025): D2 Targets, M3/M2 Inference and an Open Benchmark Against Canadian FWI and INPE”</w:t>
       </w:r>
       <w:r>
-        <w:t xml:space="preserve">, which we submit for consideration as a</w:t>
-      </w:r>
-      <w:r>
-        <w:t xml:space="preserve"> </w:t>
-      </w:r>
-      <w:r>
-        <w:rPr>
+        <w:rPr>
+          <w:rFonts w:ascii="Times New Roman" w:hAnsi="Times New Roman" w:cs="Times New Roman" w:eastAsia="Times New Roman"/>
+          <w:sz w:val="20"/>
+        </w:rPr>
+        <w:t xml:space="preserve">, which I submit for consideration as a</w:t>
+      </w:r>
+      <w:r>
+        <w:rPr>
+          <w:rFonts w:ascii="Times New Roman" w:hAnsi="Times New Roman" w:cs="Times New Roman" w:eastAsia="Times New Roman"/>
+          <w:sz w:val="20"/>
+        </w:rPr>
+        <w:t xml:space="preserve"> </w:t>
+      </w:r>
+      <w:r>
+        <w:rPr>
+          <w:rFonts w:ascii="Times New Roman" w:hAnsi="Times New Roman" w:cs="Times New Roman" w:eastAsia="Times New Roman"/>
           <w:b/>
           <w:bCs/>
+          <w:sz w:val="20"/>
         </w:rPr>
         <w:t xml:space="preserve">Research Paper</w:t>
       </w:r>
       <w:r>
-        <w:t xml:space="preserve"> </w:t>
-      </w:r>
-      <w:r>
+        <w:rPr>
+          <w:rFonts w:ascii="Times New Roman" w:hAnsi="Times New Roman" w:cs="Times New Roman" w:eastAsia="Times New Roman"/>
+          <w:sz w:val="20"/>
+        </w:rPr>
+        <w:t xml:space="preserve"> </w:t>
+      </w:r>
+      <w:r>
+        <w:rPr>
+          <w:rFonts w:ascii="Times New Roman" w:hAnsi="Times New Roman" w:cs="Times New Roman" w:eastAsia="Times New Roman"/>
+          <w:sz w:val="20"/>
+        </w:rPr>
         <w:t xml:space="preserve">in</w:t>
       </w:r>
       <w:r>
-        <w:t xml:space="preserve"> </w:t>
-      </w:r>
-      <w:r>
-        <w:rPr>
+        <w:rPr>
+          <w:rFonts w:ascii="Times New Roman" w:hAnsi="Times New Roman" w:cs="Times New Roman" w:eastAsia="Times New Roman"/>
+          <w:sz w:val="20"/>
+        </w:rPr>
+        <w:t xml:space="preserve"> </w:t>
+      </w:r>
+      <w:r>
+        <w:rPr>
+          <w:rFonts w:ascii="Times New Roman" w:hAnsi="Times New Roman" w:cs="Times New Roman" w:eastAsia="Times New Roman"/>
           <w:i/>
           <w:iCs/>
+          <w:sz w:val="20"/>
         </w:rPr>
         <w:t xml:space="preserve">Computers &amp; Geosciences</w:t>
       </w:r>
       <w:r>
+        <w:rPr>
+          <w:rFonts w:ascii="Times New Roman" w:hAnsi="Times New Roman" w:cs="Times New Roman" w:eastAsia="Times New Roman"/>
+          <w:sz w:val="20"/>
+        </w:rPr>
         <w:t xml:space="preserve">.</w:t>
+      </w:r>
+    </w:p>
+    <w:p>
+      <w:pPr>
+        <w:pStyle w:val="BodyText"/>
+        <w:spacing w:line="480" w:lineRule="auto"/>
+      </w:pPr>
+      <w:r>
+        <w:rPr>
+          <w:rFonts w:ascii="Times New Roman" w:hAnsi="Times New Roman" w:cs="Times New Roman" w:eastAsia="Times New Roman"/>
+          <w:sz w:val="20"/>
+        </w:rPr>
+        <w:t xml:space="preserve">The manuscript presents an auditable computational protocol and reproducible software infrastructure, rather than a regional machine-learning case study. Its central contribution is the formal D2 target operator, the gated M3/M2 inference policy and the open evaluation harness; the learner is deliberately replaceable.</w:t>
       </w:r>
     </w:p>
     <w:bookmarkStart w:id="9" w:name="motivation-and-core-scientific-novelty"/>
@@ -162,133 +280,245 @@
         <w:pStyle w:val="Heading3"/>
       </w:pPr>
       <w:r>
+        <w:rPr>
+          <w:rFonts w:ascii="Times New Roman" w:hAnsi="Times New Roman" w:cs="Times New Roman" w:eastAsia="Times New Roman"/>
+          <w:sz w:val="20"/>
+        </w:rPr>
         <w:t xml:space="preserve">Motivation and Core Scientific Novelty</w:t>
       </w:r>
     </w:p>
     <w:p>
       <w:pPr>
         <w:pStyle w:val="FirstParagraph"/>
-      </w:pPr>
-      <w:r>
+        <w:spacing w:line="480" w:lineRule="auto"/>
+      </w:pPr>
+      <w:r>
+        <w:rPr>
+          <w:rFonts w:ascii="Times New Roman" w:hAnsi="Times New Roman" w:cs="Times New Roman" w:eastAsia="Times New Roman"/>
+          <w:sz w:val="20"/>
+        </w:rPr>
         <w:t xml:space="preserve">Operational wildfire forecasting in geoscience machine learning frequently suffers from two pervasive methodological pathologies:</w:t>
       </w:r>
       <w:r>
-        <w:t xml:space="preserve"> </w:t>
-      </w:r>
-      <w:r>
+        <w:rPr>
+          <w:rFonts w:ascii="Times New Roman" w:hAnsi="Times New Roman" w:cs="Times New Roman" w:eastAsia="Times New Roman"/>
+          <w:sz w:val="20"/>
+        </w:rPr>
+        <w:t xml:space="preserve"> </w:t>
+      </w:r>
+      <w:r>
+        <w:rPr>
+          <w:rFonts w:ascii="Times New Roman" w:hAnsi="Times New Roman" w:cs="Times New Roman" w:eastAsia="Times New Roman"/>
+          <w:sz w:val="20"/>
+        </w:rPr>
         <w:t xml:space="preserve">1.</w:t>
       </w:r>
       <w:r>
-        <w:t xml:space="preserve"> </w:t>
-      </w:r>
-      <w:r>
-        <w:rPr>
+        <w:rPr>
+          <w:rFonts w:ascii="Times New Roman" w:hAnsi="Times New Roman" w:cs="Times New Roman" w:eastAsia="Times New Roman"/>
+          <w:sz w:val="20"/>
+        </w:rPr>
+        <w:t xml:space="preserve"> </w:t>
+      </w:r>
+      <w:r>
+        <w:rPr>
+          <w:rFonts w:ascii="Times New Roman" w:hAnsi="Times New Roman" w:cs="Times New Roman" w:eastAsia="Times New Roman"/>
           <w:b/>
           <w:bCs/>
+          <w:sz w:val="20"/>
         </w:rPr>
         <w:t xml:space="preserve">Spatial Shortcut Learning:</w:t>
       </w:r>
       <w:r>
-        <w:t xml:space="preserve"> </w:t>
-      </w:r>
-      <w:r>
+        <w:rPr>
+          <w:rFonts w:ascii="Times New Roman" w:hAnsi="Times New Roman" w:cs="Times New Roman" w:eastAsia="Times New Roman"/>
+          <w:sz w:val="20"/>
+        </w:rPr>
+        <w:t xml:space="preserve"> </w:t>
+      </w:r>
+      <w:r>
+        <w:rPr>
+          <w:rFonts w:ascii="Times New Roman" w:hAnsi="Times New Roman" w:cs="Times New Roman" w:eastAsia="Times New Roman"/>
+          <w:sz w:val="20"/>
+        </w:rPr>
         <w:t xml:space="preserve">When models include autoregressive spatial lags without isolating causal mechanisms, gradient-boosted ensembles learn trivial spatial persistence heuristics (</w:t>
       </w:r>
       <w:r>
         <w:rPr>
+          <w:rFonts w:ascii="Times New Roman" w:hAnsi="Times New Roman" w:cs="Times New Roman" w:eastAsia="Times New Roman"/>
           <w:i/>
           <w:iCs/>
+          <w:sz w:val="20"/>
         </w:rPr>
         <w:t xml:space="preserve">“fire will persist where thermal anomalies already exist”</w:t>
       </w:r>
       <w:r>
+        <w:rPr>
+          <w:rFonts w:ascii="Times New Roman" w:hAnsi="Times New Roman" w:cs="Times New Roman" w:eastAsia="Times New Roman"/>
+          <w:sz w:val="20"/>
+        </w:rPr>
         <w:t xml:space="preserve">), resulting in severe false confidence while remaining incapable of anticipating new, spontaneous, or anthropic primary ignitions.</w:t>
       </w:r>
       <w:r>
-        <w:t xml:space="preserve"> </w:t>
-      </w:r>
-      <w:r>
+        <w:rPr>
+          <w:rFonts w:ascii="Times New Roman" w:hAnsi="Times New Roman" w:cs="Times New Roman" w:eastAsia="Times New Roman"/>
+          <w:sz w:val="20"/>
+        </w:rPr>
+        <w:t xml:space="preserve"> </w:t>
+      </w:r>
+      <w:r>
+        <w:rPr>
+          <w:rFonts w:ascii="Times New Roman" w:hAnsi="Times New Roman" w:cs="Times New Roman" w:eastAsia="Times New Roman"/>
+          <w:sz w:val="20"/>
+        </w:rPr>
         <w:t xml:space="preserve">2.</w:t>
       </w:r>
       <w:r>
-        <w:t xml:space="preserve"> </w:t>
-      </w:r>
-      <w:r>
-        <w:rPr>
+        <w:rPr>
+          <w:rFonts w:ascii="Times New Roman" w:hAnsi="Times New Roman" w:cs="Times New Roman" w:eastAsia="Times New Roman"/>
+          <w:sz w:val="20"/>
+        </w:rPr>
+        <w:t xml:space="preserve"> </w:t>
+      </w:r>
+      <w:r>
+        <w:rPr>
+          <w:rFonts w:ascii="Times New Roman" w:hAnsi="Times New Roman" w:cs="Times New Roman" w:eastAsia="Times New Roman"/>
           <w:b/>
           <w:bCs/>
+          <w:sz w:val="20"/>
         </w:rPr>
         <w:t xml:space="preserve">Failure of Canonical Boreal Indices in the Subtropics:</w:t>
       </w:r>
       <w:r>
-        <w:t xml:space="preserve"> </w:t>
-      </w:r>
-      <w:r>
+        <w:rPr>
+          <w:rFonts w:ascii="Times New Roman" w:hAnsi="Times New Roman" w:cs="Times New Roman" w:eastAsia="Times New Roman"/>
+          <w:sz w:val="20"/>
+        </w:rPr>
+        <w:t xml:space="preserve"> </w:t>
+      </w:r>
+      <w:r>
+        <w:rPr>
+          <w:rFonts w:ascii="Times New Roman" w:hAnsi="Times New Roman" w:cs="Times New Roman" w:eastAsia="Times New Roman"/>
+          <w:sz w:val="20"/>
+        </w:rPr>
         <w:t xml:space="preserve">Widely deployed operational frameworks—such as the Canadian Forest Fire Weather Index (FWI) used by EFFIS/GWIS and the CPTEC/INPE Risco de Fogo—consistently fail or invert hazard rankings in water-limited subtropical biomes (e.g., the South American Gran Chaco), where vapor pressure deficit (VPD) and non-linear fuel-curing dynamics govern fire risk.</w:t>
       </w:r>
     </w:p>
     <w:p>
       <w:pPr>
         <w:pStyle w:val="BodyText"/>
-      </w:pPr>
-      <w:r>
-        <w:t xml:space="preserve">To address these challenges, we introduce</w:t>
-      </w:r>
-      <w:r>
+        <w:spacing w:line="480" w:lineRule="auto"/>
+      </w:pPr>
+      <w:r>
+        <w:rPr>
+          <w:rFonts w:ascii="Times New Roman" w:hAnsi="Times New Roman" w:cs="Times New Roman" w:eastAsia="Times New Roman"/>
+          <w:sz w:val="20"/>
+        </w:rPr>
+        <w:t xml:space="preserve">To address these challenges, I introduce</w:t>
+      </w:r>
+      <w:r>
+        <w:rPr>
+          <w:rFonts w:ascii="Times New Roman" w:hAnsi="Times New Roman" w:cs="Times New Roman" w:eastAsia="Times New Roman"/>
+          <w:sz w:val="20"/>
+        </w:rPr>
         <w:t xml:space="preserve"> </w:t>
       </w:r>
       <w:r>
         <w:rPr>
           <w:rStyle w:val="VerbatimChar"/>
+          <w:rFonts w:ascii="Times New Roman" w:hAnsi="Times New Roman" w:cs="Times New Roman" w:eastAsia="Times New Roman"/>
+          <w:sz w:val="20"/>
         </w:rPr>
         <w:t xml:space="preserve">Incendios_PY</w:t>
       </w:r>
       <w:r>
+        <w:rPr>
+          <w:rFonts w:ascii="Times New Roman" w:hAnsi="Times New Roman" w:cs="Times New Roman" w:eastAsia="Times New Roman"/>
+          <w:sz w:val="20"/>
+        </w:rPr>
         <w:t xml:space="preserve">, an open-source computational framework for reproducible decoupled wildfire modeling across</w:t>
       </w:r>
       <w:r>
-        <w:t xml:space="preserve"> </w:t>
-      </w:r>
-      <w:r>
-        <w:rPr>
+        <w:rPr>
+          <w:rFonts w:ascii="Times New Roman" w:hAnsi="Times New Roman" w:cs="Times New Roman" w:eastAsia="Times New Roman"/>
+          <w:sz w:val="20"/>
+        </w:rPr>
+        <w:t xml:space="preserve"> </w:t>
+      </w:r>
+      <w:r>
+        <w:rPr>
+          <w:rFonts w:ascii="Times New Roman" w:hAnsi="Times New Roman" w:cs="Times New Roman" w:eastAsia="Times New Roman"/>
           <w:b/>
           <w:bCs/>
+          <w:sz w:val="20"/>
         </w:rPr>
         <w:t xml:space="preserve">400 006 1-km² grid cells</w:t>
       </w:r>
       <w:r>
-        <w:t xml:space="preserve"> </w:t>
-      </w:r>
-      <w:r>
-        <w:t xml:space="preserve">over an 8-year multi-annual observation baseline (2018–2025). This horizon is anchored to the multi-sensor VIIRS 375 m constellation (Suomi-NPP, NOAA-20 and NOAA-21), which reduces single-sensor sampling bias across the modeling phases. We analytically decouple the operational task into two distinct models: (i)</w:t>
-      </w:r>
-      <w:r>
-        <w:t xml:space="preserve"> </w:t>
-      </w:r>
-      <w:r>
-        <w:rPr>
+        <w:rPr>
+          <w:rFonts w:ascii="Times New Roman" w:hAnsi="Times New Roman" w:cs="Times New Roman" w:eastAsia="Times New Roman"/>
+          <w:sz w:val="20"/>
+        </w:rPr>
+        <w:t xml:space="preserve"> </w:t>
+      </w:r>
+      <w:r>
+        <w:rPr>
+          <w:rFonts w:ascii="Times New Roman" w:hAnsi="Times New Roman" w:cs="Times New Roman" w:eastAsia="Times New Roman"/>
+          <w:sz w:val="20"/>
+        </w:rPr>
+        <w:t xml:space="preserve">over an 8-year multi-annual observation baseline (2018–2025). This horizon is anchored to the multi-sensor VIIRS 375 m constellation (Suomi-NPP, NOAA-20 and NOAA-21), which reduces single-sensor sampling bias across the modeling phases. The framework analytically decouples the operational task into two distinct models: (i)</w:t>
+      </w:r>
+      <w:r>
+        <w:rPr>
+          <w:rFonts w:ascii="Times New Roman" w:hAnsi="Times New Roman" w:cs="Times New Roman" w:eastAsia="Times New Roman"/>
+          <w:sz w:val="20"/>
+        </w:rPr>
+        <w:t xml:space="preserve"> </w:t>
+      </w:r>
+      <w:r>
+        <w:rPr>
+          <w:rFonts w:ascii="Times New Roman" w:hAnsi="Times New Roman" w:cs="Times New Roman" w:eastAsia="Times New Roman"/>
           <w:b/>
           <w:bCs/>
+          <w:sz w:val="20"/>
         </w:rPr>
         <w:t xml:space="preserve">Multiscale Socio-Ecological Hybrid Ignition</w:t>
       </w:r>
       <w:r>
-        <w:t xml:space="preserve"> </w:t>
-      </w:r>
-      <w:r>
+        <w:rPr>
+          <w:rFonts w:ascii="Times New Roman" w:hAnsi="Times New Roman" w:cs="Times New Roman" w:eastAsia="Times New Roman"/>
+          <w:sz w:val="20"/>
+        </w:rPr>
+        <w:t xml:space="preserve"> </w:t>
+      </w:r>
+      <w:r>
+        <w:rPr>
+          <w:rFonts w:ascii="Times New Roman" w:hAnsi="Times New Roman" w:cs="Times New Roman" w:eastAsia="Times New Roman"/>
+          <w:sz w:val="20"/>
+        </w:rPr>
         <w:t xml:space="preserve">(M3), guided by physics-based monotonic constraints, ecotone edge gradients, and static anthropogenic priors at 10-km and 25-km scales; and (ii)</w:t>
       </w:r>
       <w:r>
-        <w:t xml:space="preserve"> </w:t>
-      </w:r>
-      <w:r>
-        <w:rPr>
+        <w:rPr>
+          <w:rFonts w:ascii="Times New Roman" w:hAnsi="Times New Roman" w:cs="Times New Roman" w:eastAsia="Times New Roman"/>
+          <w:sz w:val="20"/>
+        </w:rPr>
+        <w:t xml:space="preserve"> </w:t>
+      </w:r>
+      <w:r>
+        <w:rPr>
+          <w:rFonts w:ascii="Times New Roman" w:hAnsi="Times New Roman" w:cs="Times New Roman" w:eastAsia="Times New Roman"/>
           <w:b/>
           <w:bCs/>
+          <w:sz w:val="20"/>
         </w:rPr>
         <w:t xml:space="preserve">Tactical Propagation</w:t>
       </w:r>
       <w:r>
+        <w:rPr>
+          <w:rFonts w:ascii="Times New Roman" w:hAnsi="Times New Roman" w:cs="Times New Roman" w:eastAsia="Times New Roman"/>
+          <w:sz w:val="20"/>
+        </w:rPr>
         <w:t xml:space="preserve">, driven by a causal spatial contagion kernel at lag t−1.</w:t>
       </w:r>
     </w:p>
@@ -299,15 +529,25 @@
         <w:pStyle w:val="Heading3"/>
       </w:pPr>
       <w:r>
+        <w:rPr>
+          <w:rFonts w:ascii="Times New Roman" w:hAnsi="Times New Roman" w:cs="Times New Roman" w:eastAsia="Times New Roman"/>
+          <w:sz w:val="20"/>
+        </w:rPr>
         <w:t xml:space="preserve">Why this Manuscript Fits</w:t>
       </w:r>
       <w:r>
-        <w:t xml:space="preserve"> </w:t>
-      </w:r>
-      <w:r>
-        <w:rPr>
+        <w:rPr>
+          <w:rFonts w:ascii="Times New Roman" w:hAnsi="Times New Roman" w:cs="Times New Roman" w:eastAsia="Times New Roman"/>
+          <w:sz w:val="20"/>
+        </w:rPr>
+        <w:t xml:space="preserve"> </w:t>
+      </w:r>
+      <w:r>
+        <w:rPr>
+          <w:rFonts w:ascii="Times New Roman" w:hAnsi="Times New Roman" w:cs="Times New Roman" w:eastAsia="Times New Roman"/>
           <w:i/>
           <w:iCs/>
+          <w:sz w:val="20"/>
         </w:rPr>
         <w:t xml:space="preserve">Computers &amp; Geosciences</w:t>
       </w:r>
@@ -315,37 +555,66 @@
     <w:p>
       <w:pPr>
         <w:pStyle w:val="FirstParagraph"/>
-      </w:pPr>
-      <w:r>
-        <w:t xml:space="preserve">Our work sits precisely at the convergence of</w:t>
-      </w:r>
-      <w:r>
-        <w:t xml:space="preserve"> </w:t>
-      </w:r>
-      <w:r>
-        <w:rPr>
+        <w:spacing w:line="480" w:lineRule="auto"/>
+      </w:pPr>
+      <w:r>
+        <w:rPr>
+          <w:rFonts w:ascii="Times New Roman" w:hAnsi="Times New Roman" w:cs="Times New Roman" w:eastAsia="Times New Roman"/>
+          <w:sz w:val="20"/>
+        </w:rPr>
+        <w:t xml:space="preserve">My work sits precisely at the convergence of</w:t>
+      </w:r>
+      <w:r>
+        <w:rPr>
+          <w:rFonts w:ascii="Times New Roman" w:hAnsi="Times New Roman" w:cs="Times New Roman" w:eastAsia="Times New Roman"/>
+          <w:sz w:val="20"/>
+        </w:rPr>
+        <w:t xml:space="preserve"> </w:t>
+      </w:r>
+      <w:r>
+        <w:rPr>
+          <w:rFonts w:ascii="Times New Roman" w:hAnsi="Times New Roman" w:cs="Times New Roman" w:eastAsia="Times New Roman"/>
           <w:b/>
           <w:bCs/>
+          <w:sz w:val="20"/>
         </w:rPr>
         <w:t xml:space="preserve">Computer Science Applications</w:t>
       </w:r>
       <w:r>
-        <w:t xml:space="preserve"> </w:t>
-      </w:r>
-      <w:r>
+        <w:rPr>
+          <w:rFonts w:ascii="Times New Roman" w:hAnsi="Times New Roman" w:cs="Times New Roman" w:eastAsia="Times New Roman"/>
+          <w:sz w:val="20"/>
+        </w:rPr>
+        <w:t xml:space="preserve"> </w:t>
+      </w:r>
+      <w:r>
+        <w:rPr>
+          <w:rFonts w:ascii="Times New Roman" w:hAnsi="Times New Roman" w:cs="Times New Roman" w:eastAsia="Times New Roman"/>
+          <w:sz w:val="20"/>
+        </w:rPr>
         <w:t xml:space="preserve">and</w:t>
       </w:r>
       <w:r>
-        <w:t xml:space="preserve"> </w:t>
-      </w:r>
-      <w:r>
-        <w:rPr>
+        <w:rPr>
+          <w:rFonts w:ascii="Times New Roman" w:hAnsi="Times New Roman" w:cs="Times New Roman" w:eastAsia="Times New Roman"/>
+          <w:sz w:val="20"/>
+        </w:rPr>
+        <w:t xml:space="preserve"> </w:t>
+      </w:r>
+      <w:r>
+        <w:rPr>
+          <w:rFonts w:ascii="Times New Roman" w:hAnsi="Times New Roman" w:cs="Times New Roman" w:eastAsia="Times New Roman"/>
           <w:b/>
           <w:bCs/>
+          <w:sz w:val="20"/>
         </w:rPr>
         <w:t xml:space="preserve">Earth and Planetary Sciences</w:t>
       </w:r>
       <w:r>
+        <w:rPr>
+          <w:rFonts w:ascii="Times New Roman" w:hAnsi="Times New Roman" w:cs="Times New Roman" w:eastAsia="Times New Roman"/>
+          <w:sz w:val="20"/>
+        </w:rPr>
         <w:t xml:space="preserve">. The computational contribution is the D2 target operator, the gated M3/M2 inference policy and a reusable evaluation harness, released as documented software. The learner is replaceable; the novelty lies in the computational contract.</w:t>
       </w:r>
     </w:p>
@@ -356,34 +625,59 @@
           <w:ilvl w:val="0"/>
           <w:numId w:val="1001"/>
         </w:numPr>
-      </w:pPr>
-      <w:r>
-        <w:rPr>
+        <w:spacing w:line="480" w:lineRule="auto"/>
+      </w:pPr>
+      <w:r>
+        <w:rPr>
+          <w:rFonts w:ascii="Times New Roman" w:hAnsi="Times New Roman" w:cs="Times New Roman" w:eastAsia="Times New Roman"/>
           <w:b/>
           <w:bCs/>
+          <w:sz w:val="20"/>
         </w:rPr>
         <w:t xml:space="preserve">High-Performance Columnar Computational Pipeline:</w:t>
       </w:r>
       <w:r>
-        <w:t xml:space="preserve"> </w:t>
-      </w:r>
-      <w:r>
-        <w:t xml:space="preserve">By integrating Apache Arrow, DuckDB, and Polars, our inference engine processes the entire national territory (400 006 km²) in</w:t>
-      </w:r>
-      <w:r>
-        <w:t xml:space="preserve"> </w:t>
-      </w:r>
-      <w:r>
-        <w:rPr>
+        <w:rPr>
+          <w:rFonts w:ascii="Times New Roman" w:hAnsi="Times New Roman" w:cs="Times New Roman" w:eastAsia="Times New Roman"/>
+          <w:sz w:val="20"/>
+        </w:rPr>
+        <w:t xml:space="preserve"> </w:t>
+      </w:r>
+      <w:r>
+        <w:rPr>
+          <w:rFonts w:ascii="Times New Roman" w:hAnsi="Times New Roman" w:cs="Times New Roman" w:eastAsia="Times New Roman"/>
+          <w:sz w:val="20"/>
+        </w:rPr>
+        <w:t xml:space="preserve">By integrating Apache Arrow, DuckDB, and Polars, the inference engine processes the entire national territory (400 006 km²) in</w:t>
+      </w:r>
+      <w:r>
+        <w:rPr>
+          <w:rFonts w:ascii="Times New Roman" w:hAnsi="Times New Roman" w:cs="Times New Roman" w:eastAsia="Times New Roman"/>
+          <w:sz w:val="20"/>
+        </w:rPr>
+        <w:t xml:space="preserve"> </w:t>
+      </w:r>
+      <w:r>
+        <w:rPr>
+          <w:rFonts w:ascii="Times New Roman" w:hAnsi="Times New Roman" w:cs="Times New Roman" w:eastAsia="Times New Roman"/>
           <w:b/>
           <w:bCs/>
+          <w:sz w:val="20"/>
         </w:rPr>
         <w:t xml:space="preserve">~3.47 seconds</w:t>
       </w:r>
       <w:r>
-        <w:t xml:space="preserve"> </w:t>
-      </w:r>
-      <w:r>
+        <w:rPr>
+          <w:rFonts w:ascii="Times New Roman" w:hAnsi="Times New Roman" w:cs="Times New Roman" w:eastAsia="Times New Roman"/>
+          <w:sz w:val="20"/>
+        </w:rPr>
+        <w:t xml:space="preserve"> </w:t>
+      </w:r>
+      <w:r>
+        <w:rPr>
+          <w:rFonts w:ascii="Times New Roman" w:hAnsi="Times New Roman" w:cs="Times New Roman" w:eastAsia="Times New Roman"/>
+          <w:sz w:val="20"/>
+        </w:rPr>
         <w:t xml:space="preserve">on a standard ARM64 machine (~2.21 GB peak RAM), demonstrating that national early-warning systems do not require prohibitive cloud infrastructure.</w:t>
       </w:r>
     </w:p>
@@ -394,19 +688,30 @@
           <w:ilvl w:val="0"/>
           <w:numId w:val="1001"/>
         </w:numPr>
-      </w:pPr>
-      <w:r>
-        <w:rPr>
+        <w:spacing w:line="480" w:lineRule="auto"/>
+      </w:pPr>
+      <w:r>
+        <w:rPr>
+          <w:rFonts w:ascii="Times New Roman" w:hAnsi="Times New Roman" w:cs="Times New Roman" w:eastAsia="Times New Roman"/>
           <w:b/>
           <w:bCs/>
+          <w:sz w:val="20"/>
         </w:rPr>
         <w:t xml:space="preserve">Physics-Guided Machine Learning (PGML):</w:t>
       </w:r>
       <w:r>
-        <w:t xml:space="preserve"> </w:t>
-      </w:r>
-      <w:r>
-        <w:t xml:space="preserve">We enforce structural monotonic constraints within LightGBM (+1 for atmospheric dryness and wind pressure, −1 for antecedent rainfall and distance), mathematically preventing counterintuitive artifacts.</w:t>
+        <w:rPr>
+          <w:rFonts w:ascii="Times New Roman" w:hAnsi="Times New Roman" w:cs="Times New Roman" w:eastAsia="Times New Roman"/>
+          <w:sz w:val="20"/>
+        </w:rPr>
+        <w:t xml:space="preserve"> </w:t>
+      </w:r>
+      <w:r>
+        <w:rPr>
+          <w:rFonts w:ascii="Times New Roman" w:hAnsi="Times New Roman" w:cs="Times New Roman" w:eastAsia="Times New Roman"/>
+          <w:sz w:val="20"/>
+        </w:rPr>
+        <w:t xml:space="preserve">The framework enforces structural monotonic constraints within LightGBM (+1 for atmospheric dryness and wind pressure, −1 for antecedent rainfall and distance), mathematically preventing counterintuitive artifacts.</w:t>
       </w:r>
     </w:p>
     <w:p>
@@ -416,47 +721,82 @@
           <w:ilvl w:val="0"/>
           <w:numId w:val="1001"/>
         </w:numPr>
-      </w:pPr>
-      <w:r>
-        <w:rPr>
+        <w:spacing w:line="480" w:lineRule="auto"/>
+      </w:pPr>
+      <w:r>
+        <w:rPr>
+          <w:rFonts w:ascii="Times New Roman" w:hAnsi="Times New Roman" w:cs="Times New Roman" w:eastAsia="Times New Roman"/>
           <w:b/>
           <w:bCs/>
+          <w:sz w:val="20"/>
         </w:rPr>
         <w:t xml:space="preserve">Spatial and Temporal Control:</w:t>
       </w:r>
       <w:r>
-        <w:t xml:space="preserve"> </w:t>
-      </w:r>
-      <w:r>
-        <w:t xml:space="preserve">We use the</w:t>
-      </w:r>
-      <w:r>
-        <w:t xml:space="preserve"> </w:t>
-      </w:r>
-      <w:r>
-        <w:rPr>
+        <w:rPr>
+          <w:rFonts w:ascii="Times New Roman" w:hAnsi="Times New Roman" w:cs="Times New Roman" w:eastAsia="Times New Roman"/>
+          <w:sz w:val="20"/>
+        </w:rPr>
+        <w:t xml:space="preserve"> </w:t>
+      </w:r>
+      <w:r>
+        <w:rPr>
+          <w:rFonts w:ascii="Times New Roman" w:hAnsi="Times New Roman" w:cs="Times New Roman" w:eastAsia="Times New Roman"/>
+          <w:sz w:val="20"/>
+        </w:rPr>
+        <w:t xml:space="preserve">The study uses the</w:t>
+      </w:r>
+      <w:r>
+        <w:rPr>
+          <w:rFonts w:ascii="Times New Roman" w:hAnsi="Times New Roman" w:cs="Times New Roman" w:eastAsia="Times New Roman"/>
+          <w:sz w:val="20"/>
+        </w:rPr>
+        <w:t xml:space="preserve"> </w:t>
+      </w:r>
+      <w:r>
+        <w:rPr>
+          <w:rFonts w:ascii="Times New Roman" w:hAnsi="Times New Roman" w:cs="Times New Roman" w:eastAsia="Times New Roman"/>
           <w:b/>
           <w:bCs/>
+          <w:sz w:val="20"/>
         </w:rPr>
         <w:t xml:space="preserve">D2 target definition</w:t>
       </w:r>
       <w:r>
-        <w:t xml:space="preserve"> </w:t>
-      </w:r>
-      <w:r>
-        <w:t xml:space="preserve">(no t-1 fire within 25 km; no same-cell fire in 10 days) and multi-year out-of-time test partitions (2024–2025). We also implement a</w:t>
-      </w:r>
-      <w:r>
-        <w:t xml:space="preserve"> </w:t>
-      </w:r>
-      <w:r>
-        <w:rPr>
+        <w:rPr>
+          <w:rFonts w:ascii="Times New Roman" w:hAnsi="Times New Roman" w:cs="Times New Roman" w:eastAsia="Times New Roman"/>
+          <w:sz w:val="20"/>
+        </w:rPr>
+        <w:t xml:space="preserve"> </w:t>
+      </w:r>
+      <w:r>
+        <w:rPr>
+          <w:rFonts w:ascii="Times New Roman" w:hAnsi="Times New Roman" w:cs="Times New Roman" w:eastAsia="Times New Roman"/>
+          <w:sz w:val="20"/>
+        </w:rPr>
+        <w:t xml:space="preserve">(no t-1 fire within 25 km; no same-cell fire in 10 days) and multi-year out-of-time test partitions (2024–2025). The framework also implements a</w:t>
+      </w:r>
+      <w:r>
+        <w:rPr>
+          <w:rFonts w:ascii="Times New Roman" w:hAnsi="Times New Roman" w:cs="Times New Roman" w:eastAsia="Times New Roman"/>
+          <w:sz w:val="20"/>
+        </w:rPr>
+        <w:t xml:space="preserve"> </w:t>
+      </w:r>
+      <w:r>
+        <w:rPr>
+          <w:rFonts w:ascii="Times New Roman" w:hAnsi="Times New Roman" w:cs="Times New Roman" w:eastAsia="Times New Roman"/>
           <w:b/>
           <w:bCs/>
+          <w:sz w:val="20"/>
         </w:rPr>
         <w:t xml:space="preserve">50-km spatial block holdout with a 20-km buffer</w:t>
       </w:r>
       <w:r>
+        <w:rPr>
+          <w:rFonts w:ascii="Times New Roman" w:hAnsi="Times New Roman" w:cs="Times New Roman" w:eastAsia="Times New Roman"/>
+          <w:sz w:val="20"/>
+        </w:rPr>
         <w:t xml:space="preserve">. Priors are causal (monthly cutoff, rolling 3-year window).</w:t>
       </w:r>
     </w:p>
@@ -467,61 +807,104 @@
           <w:ilvl w:val="0"/>
           <w:numId w:val="1001"/>
         </w:numPr>
-      </w:pPr>
-      <w:r>
-        <w:rPr>
+        <w:spacing w:line="480" w:lineRule="auto"/>
+      </w:pPr>
+      <w:r>
+        <w:rPr>
+          <w:rFonts w:ascii="Times New Roman" w:hAnsi="Times New Roman" w:cs="Times New Roman" w:eastAsia="Times New Roman"/>
           <w:b/>
           <w:bCs/>
+          <w:sz w:val="20"/>
         </w:rPr>
         <w:t xml:space="preserve">Software Engineering and Reproducibility Standards:</w:t>
       </w:r>
       <w:r>
-        <w:t xml:space="preserve"> </w:t>
-      </w:r>
-      <w:r>
+        <w:rPr>
+          <w:rFonts w:ascii="Times New Roman" w:hAnsi="Times New Roman" w:cs="Times New Roman" w:eastAsia="Times New Roman"/>
+          <w:sz w:val="20"/>
+        </w:rPr>
+        <w:t xml:space="preserve"> </w:t>
+      </w:r>
+      <w:r>
+        <w:rPr>
+          <w:rFonts w:ascii="Times New Roman" w:hAnsi="Times New Roman" w:cs="Times New Roman" w:eastAsia="Times New Roman"/>
+          <w:sz w:val="20"/>
+        </w:rPr>
         <w:t xml:space="preserve">The framework is packaged with a complete automated test suite of</w:t>
       </w:r>
       <w:r>
-        <w:t xml:space="preserve"> </w:t>
-      </w:r>
-      <w:r>
-        <w:rPr>
+        <w:rPr>
+          <w:rFonts w:ascii="Times New Roman" w:hAnsi="Times New Roman" w:cs="Times New Roman" w:eastAsia="Times New Roman"/>
+          <w:sz w:val="20"/>
+        </w:rPr>
+        <w:t xml:space="preserve"> </w:t>
+      </w:r>
+      <w:r>
+        <w:rPr>
+          <w:rFonts w:ascii="Times New Roman" w:hAnsi="Times New Roman" w:cs="Times New Roman" w:eastAsia="Times New Roman"/>
           <w:b/>
           <w:bCs/>
+          <w:sz w:val="20"/>
         </w:rPr>
         <w:t xml:space="preserve">76 unit tests</w:t>
       </w:r>
       <w:r>
-        <w:t xml:space="preserve"> </w:t>
-      </w:r>
-      <w:r>
+        <w:rPr>
+          <w:rFonts w:ascii="Times New Roman" w:hAnsi="Times New Roman" w:cs="Times New Roman" w:eastAsia="Times New Roman"/>
+          <w:sz w:val="20"/>
+        </w:rPr>
+        <w:t xml:space="preserve"> </w:t>
+      </w:r>
+      <w:r>
+        <w:rPr>
+          <w:rFonts w:ascii="Times New Roman" w:hAnsi="Times New Roman" w:cs="Times New Roman" w:eastAsia="Times New Roman"/>
+          <w:sz w:val="20"/>
+        </w:rPr>
         <w:t xml:space="preserve">(</w:t>
       </w:r>
       <w:r>
         <w:rPr>
           <w:rStyle w:val="VerbatimChar"/>
+          <w:rFonts w:ascii="Times New Roman" w:hAnsi="Times New Roman" w:cs="Times New Roman" w:eastAsia="Times New Roman"/>
+          <w:sz w:val="20"/>
         </w:rPr>
         <w:t xml:space="preserve">tests/</w:t>
       </w:r>
       <w:r>
+        <w:rPr>
+          <w:rFonts w:ascii="Times New Roman" w:hAnsi="Times New Roman" w:cs="Times New Roman" w:eastAsia="Times New Roman"/>
+          <w:sz w:val="20"/>
+        </w:rPr>
         <w:t xml:space="preserve">) running in ≈1 minute, verifying algebraic invariants, physical monotonicity, conformal coverage, and spatial KD-Tree queries. All code and workflows are versioned from raw ingestion (</w:t>
       </w:r>
       <w:r>
         <w:rPr>
           <w:rStyle w:val="VerbatimChar"/>
+          <w:rFonts w:ascii="Times New Roman" w:hAnsi="Times New Roman" w:cs="Times New Roman" w:eastAsia="Times New Roman"/>
+          <w:sz w:val="20"/>
         </w:rPr>
         <w:t xml:space="preserve">scripts/00_...</w:t>
       </w:r>
       <w:r>
+        <w:rPr>
+          <w:rFonts w:ascii="Times New Roman" w:hAnsi="Times New Roman" w:cs="Times New Roman" w:eastAsia="Times New Roman"/>
+          <w:sz w:val="20"/>
+        </w:rPr>
         <w:t xml:space="preserve">) to release and validation outputs (</w:t>
       </w:r>
       <w:r>
         <w:rPr>
           <w:rStyle w:val="VerbatimChar"/>
+          <w:rFonts w:ascii="Times New Roman" w:hAnsi="Times New Roman" w:cs="Times New Roman" w:eastAsia="Times New Roman"/>
+          <w:sz w:val="20"/>
         </w:rPr>
         <w:t xml:space="preserve">scripts/34_...</w:t>
       </w:r>
       <w:r>
+        <w:rPr>
+          <w:rFonts w:ascii="Times New Roman" w:hAnsi="Times New Roman" w:cs="Times New Roman" w:eastAsia="Times New Roman"/>
+          <w:sz w:val="20"/>
+        </w:rPr>
         <w:t xml:space="preserve">) under the permissive MIT License.</w:t>
       </w:r>
     </w:p>
@@ -532,98 +915,179 @@
           <w:ilvl w:val="0"/>
           <w:numId w:val="1001"/>
         </w:numPr>
-      </w:pPr>
-      <w:r>
-        <w:rPr>
+        <w:spacing w:line="480" w:lineRule="auto"/>
+      </w:pPr>
+      <w:r>
+        <w:rPr>
+          <w:rFonts w:ascii="Times New Roman" w:hAnsi="Times New Roman" w:cs="Times New Roman" w:eastAsia="Times New Roman"/>
           <w:b/>
           <w:bCs/>
+          <w:sz w:val="20"/>
         </w:rPr>
         <w:t xml:space="preserve">Quantitative International Benchmarking:</w:t>
       </w:r>
       <w:r>
-        <w:t xml:space="preserve"> </w:t>
-      </w:r>
-      <w:r>
-        <w:t xml:space="preserve">In retrospective temporal testing over 1 813 966 D2 cell-days during 2024–2025, our hybrid ignition layer M3 achieves a ROC-AUC of</w:t>
-      </w:r>
-      <w:r>
-        <w:t xml:space="preserve"> </w:t>
-      </w:r>
-      <w:r>
-        <w:rPr>
+        <w:rPr>
+          <w:rFonts w:ascii="Times New Roman" w:hAnsi="Times New Roman" w:cs="Times New Roman" w:eastAsia="Times New Roman"/>
+          <w:sz w:val="20"/>
+        </w:rPr>
+        <w:t xml:space="preserve"> </w:t>
+      </w:r>
+      <w:r>
+        <w:rPr>
+          <w:rFonts w:ascii="Times New Roman" w:hAnsi="Times New Roman" w:cs="Times New Roman" w:eastAsia="Times New Roman"/>
+          <w:sz w:val="20"/>
+        </w:rPr>
+        <w:t xml:space="preserve">In retrospective temporal testing over 1 813 966 D2 cell-days during 2024–2025, the hybrid ignition layer M3 achieves a ROC-AUC of</w:t>
+      </w:r>
+      <w:r>
+        <w:rPr>
+          <w:rFonts w:ascii="Times New Roman" w:hAnsi="Times New Roman" w:cs="Times New Roman" w:eastAsia="Times New Roman"/>
+          <w:sz w:val="20"/>
+        </w:rPr>
+        <w:t xml:space="preserve"> </w:t>
+      </w:r>
+      <w:r>
+        <w:rPr>
+          <w:rFonts w:ascii="Times New Roman" w:hAnsi="Times New Roman" w:cs="Times New Roman" w:eastAsia="Times New Roman"/>
           <w:b/>
           <w:bCs/>
+          <w:sz w:val="20"/>
         </w:rPr>
         <w:t xml:space="preserve">0.8021</w:t>
       </w:r>
       <w:r>
-        <w:t xml:space="preserve"> </w:t>
-      </w:r>
-      <w:r>
+        <w:rPr>
+          <w:rFonts w:ascii="Times New Roman" w:hAnsi="Times New Roman" w:cs="Times New Roman" w:eastAsia="Times New Roman"/>
+          <w:sz w:val="20"/>
+        </w:rPr>
+        <w:t xml:space="preserve"> </w:t>
+      </w:r>
+      <w:r>
+        <w:rPr>
+          <w:rFonts w:ascii="Times New Roman" w:hAnsi="Times New Roman" w:cs="Times New Roman" w:eastAsia="Times New Roman"/>
+          <w:sz w:val="20"/>
+        </w:rPr>
         <w:t xml:space="preserve">in the Gran Chaco and</w:t>
       </w:r>
       <w:r>
-        <w:t xml:space="preserve"> </w:t>
-      </w:r>
-      <w:r>
-        <w:rPr>
+        <w:rPr>
+          <w:rFonts w:ascii="Times New Roman" w:hAnsi="Times New Roman" w:cs="Times New Roman" w:eastAsia="Times New Roman"/>
+          <w:sz w:val="20"/>
+        </w:rPr>
+        <w:t xml:space="preserve"> </w:t>
+      </w:r>
+      <w:r>
+        <w:rPr>
+          <w:rFonts w:ascii="Times New Roman" w:hAnsi="Times New Roman" w:cs="Times New Roman" w:eastAsia="Times New Roman"/>
           <w:b/>
           <w:bCs/>
+          <w:sz w:val="20"/>
         </w:rPr>
         <w:t xml:space="preserve">0.7534</w:t>
       </w:r>
       <w:r>
-        <w:t xml:space="preserve"> </w:t>
-      </w:r>
-      <w:r>
+        <w:rPr>
+          <w:rFonts w:ascii="Times New Roman" w:hAnsi="Times New Roman" w:cs="Times New Roman" w:eastAsia="Times New Roman"/>
+          <w:sz w:val="20"/>
+        </w:rPr>
+        <w:t xml:space="preserve"> </w:t>
+      </w:r>
+      <w:r>
+        <w:rPr>
+          <w:rFonts w:ascii="Times New Roman" w:hAnsi="Times New Roman" w:cs="Times New Roman" w:eastAsia="Times New Roman"/>
+          <w:sz w:val="20"/>
+        </w:rPr>
         <w:t xml:space="preserve">in the Oriental Region, versus</w:t>
       </w:r>
       <w:r>
-        <w:t xml:space="preserve"> </w:t>
-      </w:r>
-      <w:r>
-        <w:rPr>
+        <w:rPr>
+          <w:rFonts w:ascii="Times New Roman" w:hAnsi="Times New Roman" w:cs="Times New Roman" w:eastAsia="Times New Roman"/>
+          <w:sz w:val="20"/>
+        </w:rPr>
+        <w:t xml:space="preserve"> </w:t>
+      </w:r>
+      <w:r>
+        <w:rPr>
+          <w:rFonts w:ascii="Times New Roman" w:hAnsi="Times New Roman" w:cs="Times New Roman" w:eastAsia="Times New Roman"/>
           <w:b/>
           <w:bCs/>
-        </w:rPr>
-        <w:t xml:space="preserve">0.5173 / 0.5564</w:t>
-      </w:r>
-      <w:r>
-        <w:t xml:space="preserve"> </w:t>
-      </w:r>
-      <w:r>
+          <w:sz w:val="20"/>
+        </w:rPr>
+        <w:t xml:space="preserve">0.5059 / 0.5611</w:t>
+      </w:r>
+      <w:r>
+        <w:rPr>
+          <w:rFonts w:ascii="Times New Roman" w:hAnsi="Times New Roman" w:cs="Times New Roman" w:eastAsia="Times New Roman"/>
+          <w:sz w:val="20"/>
+        </w:rPr>
+        <w:t xml:space="preserve"> </w:t>
+      </w:r>
+      <w:r>
+        <w:rPr>
+          <w:rFonts w:ascii="Times New Roman" w:hAnsi="Times New Roman" w:cs="Times New Roman" w:eastAsia="Times New Roman"/>
+          <w:sz w:val="20"/>
+        </w:rPr>
         <w:t xml:space="preserve">for the full Canadian FWI and</w:t>
       </w:r>
       <w:r>
-        <w:t xml:space="preserve"> </w:t>
-      </w:r>
-      <w:r>
-        <w:rPr>
+        <w:rPr>
+          <w:rFonts w:ascii="Times New Roman" w:hAnsi="Times New Roman" w:cs="Times New Roman" w:eastAsia="Times New Roman"/>
+          <w:sz w:val="20"/>
+        </w:rPr>
+        <w:t xml:space="preserve"> </w:t>
+      </w:r>
+      <w:r>
+        <w:rPr>
+          <w:rFonts w:ascii="Times New Roman" w:hAnsi="Times New Roman" w:cs="Times New Roman" w:eastAsia="Times New Roman"/>
           <w:b/>
           <w:bCs/>
-        </w:rPr>
-        <w:t xml:space="preserve">0.5389 / 0.4990</w:t>
-      </w:r>
-      <w:r>
-        <w:t xml:space="preserve"> </w:t>
-      </w:r>
-      <w:r>
+          <w:sz w:val="20"/>
+        </w:rPr>
+        <w:t xml:space="preserve">0.5266 / 0.4973</w:t>
+      </w:r>
+      <w:r>
+        <w:rPr>
+          <w:rFonts w:ascii="Times New Roman" w:hAnsi="Times New Roman" w:cs="Times New Roman" w:eastAsia="Times New Roman"/>
+          <w:sz w:val="20"/>
+        </w:rPr>
+        <w:t xml:space="preserve"> </w:t>
+      </w:r>
+      <w:r>
+        <w:rPr>
+          <w:rFonts w:ascii="Times New Roman" w:hAnsi="Times New Roman" w:cs="Times New Roman" w:eastAsia="Times New Roman"/>
+          <w:sz w:val="20"/>
+        </w:rPr>
         <w:t xml:space="preserve">for the INPE. Case-control F0.5 precision is 32.82 % / 30.13 %; after correction to population prevalence (~0.015 % / 0.041 %), operational precision is 0.082 % / 0.198 %. Tactical propagation achieves ROC-AUC</w:t>
       </w:r>
       <w:r>
-        <w:t xml:space="preserve"> </w:t>
-      </w:r>
-      <w:r>
-        <w:rPr>
+        <w:rPr>
+          <w:rFonts w:ascii="Times New Roman" w:hAnsi="Times New Roman" w:cs="Times New Roman" w:eastAsia="Times New Roman"/>
+          <w:sz w:val="20"/>
+        </w:rPr>
+        <w:t xml:space="preserve"> </w:t>
+      </w:r>
+      <w:r>
+        <w:rPr>
+          <w:rFonts w:ascii="Times New Roman" w:hAnsi="Times New Roman" w:cs="Times New Roman" w:eastAsia="Times New Roman"/>
           <w:b/>
           <w:bCs/>
+          <w:sz w:val="20"/>
         </w:rPr>
         <w:t xml:space="preserve">0.9039</w:t>
       </w:r>
       <w:r>
-        <w:t xml:space="preserve"> </w:t>
-      </w:r>
-      <w:r>
+        <w:rPr>
+          <w:rFonts w:ascii="Times New Roman" w:hAnsi="Times New Roman" w:cs="Times New Roman" w:eastAsia="Times New Roman"/>
+          <w:sz w:val="20"/>
+        </w:rPr>
+        <w:t xml:space="preserve"> </w:t>
+      </w:r>
+      <w:r>
+        <w:rPr>
+          <w:rFonts w:ascii="Times New Roman" w:hAnsi="Times New Roman" w:cs="Times New Roman" w:eastAsia="Times New Roman"/>
+          <w:sz w:val="20"/>
+        </w:rPr>
         <w:t xml:space="preserve">(Chaco) and population precision 9.67 %. The 2023 validation selected M3 for temporal nowcasting and M2 as the operational fallback; M1 was rejected as a fallback. These corrected metrics are the honest operational benchmark.</w:t>
       </w:r>
     </w:p>
@@ -634,6 +1098,10 @@
         <w:pStyle w:val="Heading3"/>
       </w:pPr>
       <w:r>
+        <w:rPr>
+          <w:rFonts w:ascii="Times New Roman" w:hAnsi="Times New Roman" w:cs="Times New Roman" w:eastAsia="Times New Roman"/>
+          <w:sz w:val="20"/>
+        </w:rPr>
         <w:t xml:space="preserve">Mandatory Declarations</w:t>
       </w:r>
     </w:p>
@@ -644,8 +1112,13 @@
           <w:ilvl w:val="0"/>
           <w:numId w:val="1002"/>
         </w:numPr>
-      </w:pPr>
-      <w:r>
+        <w:spacing w:line="480" w:lineRule="auto"/>
+      </w:pPr>
+      <w:r>
+        <w:rPr>
+          <w:rFonts w:ascii="Times New Roman" w:hAnsi="Times New Roman" w:cs="Times New Roman" w:eastAsia="Times New Roman"/>
+          <w:sz w:val="20"/>
+        </w:rPr>
         <w:t xml:space="preserve">This manuscript has not been published previously, is not under consideration for publication elsewhere, and its publication has been approved by the author.</w:t>
       </w:r>
     </w:p>
@@ -656,30 +1129,51 @@
           <w:ilvl w:val="0"/>
           <w:numId w:val="1002"/>
         </w:numPr>
-      </w:pPr>
-      <w:r>
+        <w:spacing w:line="480" w:lineRule="auto"/>
+      </w:pPr>
+      <w:r>
+        <w:rPr>
+          <w:rFonts w:ascii="Times New Roman" w:hAnsi="Times New Roman" w:cs="Times New Roman" w:eastAsia="Times New Roman"/>
+          <w:sz w:val="20"/>
+        </w:rPr>
         <w:t xml:space="preserve">All source code and reproduction scripts are openly hosted on GitHub (</w:t>
       </w:r>
       <w:r>
         <w:rPr>
           <w:rStyle w:val="VerbatimChar"/>
+          <w:rFonts w:ascii="Times New Roman" w:hAnsi="Times New Roman" w:cs="Times New Roman" w:eastAsia="Times New Roman"/>
+          <w:sz w:val="20"/>
         </w:rPr>
         <w:t xml:space="preserve">https://github.com/sanchezmartin093-code/Incendios_PY</w:t>
       </w:r>
       <w:r>
+        <w:rPr>
+          <w:rFonts w:ascii="Times New Roman" w:hAnsi="Times New Roman" w:cs="Times New Roman" w:eastAsia="Times New Roman"/>
+          <w:sz w:val="20"/>
+        </w:rPr>
         <w:t xml:space="preserve">). Processed data and trained models are documented with SHA-256 hashes in</w:t>
       </w:r>
       <w:r>
+        <w:rPr>
+          <w:rFonts w:ascii="Times New Roman" w:hAnsi="Times New Roman" w:cs="Times New Roman" w:eastAsia="Times New Roman"/>
+          <w:sz w:val="20"/>
+        </w:rPr>
         <w:t xml:space="preserve"> </w:t>
       </w:r>
       <w:r>
         <w:rPr>
           <w:rStyle w:val="VerbatimChar"/>
+          <w:rFonts w:ascii="Times New Roman" w:hAnsi="Times New Roman" w:cs="Times New Roman" w:eastAsia="Times New Roman"/>
+          <w:sz w:val="20"/>
         </w:rPr>
         <w:t xml:space="preserve">fuentes/MANIFIESTO_DATOS_v3.csv</w:t>
       </w:r>
       <w:r>
-        <w:t xml:space="preserve">, available in the v2.0.1 GitHub release, and indexed by the code and data concept DOIs (10.5281/zenodo.23675104; 10.5281/zenodo.23675278).</w:t>
+        <w:rPr>
+          <w:rFonts w:ascii="Times New Roman" w:hAnsi="Times New Roman" w:cs="Times New Roman" w:eastAsia="Times New Roman"/>
+          <w:sz w:val="20"/>
+        </w:rPr>
+        <w:t xml:space="preserve">, available in the v2.1.0 GitHub release, and indexed by the code and data concept DOIs (10.5281/zenodo.23675104; 10.5281/zenodo.23675278).</w:t>
       </w:r>
     </w:p>
     <w:p>
@@ -689,57 +1183,103 @@
           <w:ilvl w:val="0"/>
           <w:numId w:val="1002"/>
         </w:numPr>
-      </w:pPr>
-      <w:r>
-        <w:t xml:space="preserve">We declare no competing financial or non-financial conflicts of interest.</w:t>
+        <w:spacing w:line="480" w:lineRule="auto"/>
+      </w:pPr>
+      <w:r>
+        <w:rPr>
+          <w:rFonts w:ascii="Times New Roman" w:hAnsi="Times New Roman" w:cs="Times New Roman" w:eastAsia="Times New Roman"/>
+          <w:sz w:val="20"/>
+        </w:rPr>
+        <w:t xml:space="preserve">I declare no competing financial or non-financial conflicts of interest.</w:t>
       </w:r>
     </w:p>
     <w:p>
       <w:pPr>
         <w:pStyle w:val="FirstParagraph"/>
-      </w:pPr>
-      <w:r>
+        <w:spacing w:line="480" w:lineRule="auto"/>
+      </w:pPr>
+      <w:r>
+        <w:rPr>
+          <w:rFonts w:ascii="Times New Roman" w:hAnsi="Times New Roman" w:cs="Times New Roman" w:eastAsia="Times New Roman"/>
+          <w:sz w:val="20"/>
+        </w:rPr>
         <w:t xml:space="preserve">Thank you very much for your time, consideration, and editorial guidance.</w:t>
       </w:r>
     </w:p>
     <w:p>
       <w:pPr>
         <w:pStyle w:val="BodyText"/>
-      </w:pPr>
-      <w:r>
+        <w:spacing w:line="480" w:lineRule="auto"/>
+      </w:pPr>
+      <w:r>
+        <w:rPr>
+          <w:rFonts w:ascii="Times New Roman" w:hAnsi="Times New Roman" w:cs="Times New Roman" w:eastAsia="Times New Roman"/>
+          <w:sz w:val="20"/>
+        </w:rPr>
         <w:t xml:space="preserve">Sincerely,</w:t>
       </w:r>
     </w:p>
     <w:p>
       <w:pPr>
         <w:pStyle w:val="BodyText"/>
-      </w:pPr>
-      <w:r>
-        <w:rPr>
+        <w:spacing w:line="480" w:lineRule="auto"/>
+      </w:pPr>
+      <w:r>
+        <w:rPr>
+          <w:rFonts w:ascii="Times New Roman" w:hAnsi="Times New Roman" w:cs="Times New Roman" w:eastAsia="Times New Roman"/>
           <w:b/>
           <w:bCs/>
+          <w:sz w:val="20"/>
         </w:rPr>
         <w:t xml:space="preserve">Martín Sánchez Insfrán, MD</w:t>
       </w:r>
       <w:r>
+        <w:rPr>
+          <w:rFonts w:ascii="Times New Roman" w:hAnsi="Times New Roman" w:cs="Times New Roman" w:eastAsia="Times New Roman"/>
+          <w:sz w:val="20"/>
+        </w:rPr>
         <w:br/>
       </w:r>
       <w:r>
+        <w:rPr>
+          <w:rFonts w:ascii="Times New Roman" w:hAnsi="Times New Roman" w:cs="Times New Roman" w:eastAsia="Times New Roman"/>
+          <w:sz w:val="20"/>
+        </w:rPr>
         <w:t xml:space="preserve">Independent Researcher / Surgeon</w:t>
       </w:r>
       <w:r>
+        <w:rPr>
+          <w:rFonts w:ascii="Times New Roman" w:hAnsi="Times New Roman" w:cs="Times New Roman" w:eastAsia="Times New Roman"/>
+          <w:sz w:val="20"/>
+        </w:rPr>
         <w:br/>
       </w:r>
       <w:r>
+        <w:rPr>
+          <w:rFonts w:ascii="Times New Roman" w:hAnsi="Times New Roman" w:cs="Times New Roman" w:eastAsia="Times New Roman"/>
+          <w:sz w:val="20"/>
+        </w:rPr>
         <w:t xml:space="preserve">Asunción, Republic of Paraguay</w:t>
       </w:r>
       <w:r>
+        <w:rPr>
+          <w:rFonts w:ascii="Times New Roman" w:hAnsi="Times New Roman" w:cs="Times New Roman" w:eastAsia="Times New Roman"/>
+          <w:sz w:val="20"/>
+        </w:rPr>
         <w:br/>
       </w:r>
       <w:r>
+        <w:rPr>
+          <w:rFonts w:ascii="Times New Roman" w:hAnsi="Times New Roman" w:cs="Times New Roman" w:eastAsia="Times New Roman"/>
+          <w:sz w:val="20"/>
+        </w:rPr>
         <w:t xml:space="preserve">ORCID:</w:t>
       </w:r>
       <w:r>
+        <w:rPr>
+          <w:rFonts w:ascii="Times New Roman" w:hAnsi="Times New Roman" w:cs="Times New Roman" w:eastAsia="Times New Roman"/>
+          <w:sz w:val="20"/>
+        </w:rPr>
         <w:t xml:space="preserve"> </w:t>
       </w:r>
       <w:hyperlink r:id="rId11">
@@ -751,33 +1291,67 @@
         </w:r>
       </w:hyperlink>
       <w:r>
+        <w:rPr>
+          <w:rFonts w:ascii="Times New Roman" w:hAnsi="Times New Roman" w:cs="Times New Roman" w:eastAsia="Times New Roman"/>
+          <w:sz w:val="20"/>
+        </w:rPr>
         <w:br/>
       </w:r>
       <w:r>
+        <w:rPr>
+          <w:rFonts w:ascii="Times New Roman" w:hAnsi="Times New Roman" w:cs="Times New Roman" w:eastAsia="Times New Roman"/>
+          <w:sz w:val="20"/>
+        </w:rPr>
         <w:t xml:space="preserve">Email:</w:t>
       </w:r>
       <w:r>
+        <w:rPr>
+          <w:rFonts w:ascii="Times New Roman" w:hAnsi="Times New Roman" w:cs="Times New Roman" w:eastAsia="Times New Roman"/>
+          <w:sz w:val="20"/>
+        </w:rPr>
         <w:t xml:space="preserve"> </w:t>
       </w:r>
       <w:r>
         <w:rPr>
           <w:rStyle w:val="VerbatimChar"/>
+          <w:rFonts w:ascii="Times New Roman" w:hAnsi="Times New Roman" w:cs="Times New Roman" w:eastAsia="Times New Roman"/>
+          <w:sz w:val="20"/>
         </w:rPr>
         <w:t xml:space="preserve">sanchez.martin093@gmail.com</w:t>
       </w:r>
       <w:r>
+        <w:rPr>
+          <w:rFonts w:ascii="Times New Roman" w:hAnsi="Times New Roman" w:cs="Times New Roman" w:eastAsia="Times New Roman"/>
+          <w:sz w:val="20"/>
+        </w:rPr>
         <w:br/>
       </w:r>
       <w:r>
+        <w:rPr>
+          <w:rFonts w:ascii="Times New Roman" w:hAnsi="Times New Roman" w:cs="Times New Roman" w:eastAsia="Times New Roman"/>
+          <w:sz w:val="20"/>
+        </w:rPr>
         <w:t xml:space="preserve">Phone: +595 971 907 727</w:t>
       </w:r>
       <w:r>
+        <w:rPr>
+          <w:rFonts w:ascii="Times New Roman" w:hAnsi="Times New Roman" w:cs="Times New Roman" w:eastAsia="Times New Roman"/>
+          <w:sz w:val="20"/>
+        </w:rPr>
         <w:br/>
       </w:r>
       <w:r>
+        <w:rPr>
+          <w:rFonts w:ascii="Times New Roman" w:hAnsi="Times New Roman" w:cs="Times New Roman" w:eastAsia="Times New Roman"/>
+          <w:sz w:val="20"/>
+        </w:rPr>
         <w:t xml:space="preserve">Code Repository:</w:t>
       </w:r>
       <w:r>
+        <w:rPr>
+          <w:rFonts w:ascii="Times New Roman" w:hAnsi="Times New Roman" w:cs="Times New Roman" w:eastAsia="Times New Roman"/>
+          <w:sz w:val="20"/>
+        </w:rPr>
         <w:t xml:space="preserve"> </w:t>
       </w:r>
       <w:hyperlink r:id="rId12">
@@ -791,9 +1365,12 @@
     </w:p>
     <w:bookmarkEnd w:id="13"/>
     <w:sectPr>
+      <w:footerReference w:type="default" r:id="rId9"/>
       <w:footnotePr>
         <w:numRestart w:val="eachSect"/>
       </w:footnotePr>
+      <w:pgSz w:w="12240" w:h="15840"/>
+      <w:pgMar w:left="1440" w:right="1440" w:top="1440" w:bottom="1440"/>
     </w:sectPr>
   </w:body>
 </w:document>
@@ -801,6 +1378,24 @@
 
 <file path=word/comments.xml><?xml version="1.0" encoding="utf-8"?>
 <w:comments xmlns:w="http://schemas.openxmlformats.org/wordprocessingml/2006/main" xmlns:m="http://schemas.openxmlformats.org/officeDocument/2006/math" xmlns:r="http://schemas.openxmlformats.org/officeDocument/2006/relationships" xmlns:o="urn:schemas-microsoft-com:office:office" xmlns:v="urn:schemas-microsoft-com:vml" xmlns:w10="urn:schemas-microsoft-com:office:word" xmlns:a="http://schemas.openxmlformats.org/drawingml/2006/main" xmlns:pic="http://schemas.openxmlformats.org/drawingml/2006/picture" xmlns:wp="http://schemas.openxmlformats.org/drawingml/2006/wordprocessingDrawing"/>
+</file>
+
+<file path=word/footer1.xml><?xml version="1.0" encoding="utf-8"?>
+<w:ftr xmlns:m="http://schemas.openxmlformats.org/officeDocument/2006/math" xmlns:mc="http://schemas.openxmlformats.org/markup-compatibility/2006" xmlns:mo="http://schemas.microsoft.com/office/mac/office/2008/main" xmlns:mv="urn:schemas-microsoft-com:mac:vml" xmlns:o="urn:schemas-microsoft-com:office:office" xmlns:r="http://schemas.openxmlformats.org/officeDocument/2006/relationships" xmlns:v="urn:schemas-microsoft-com:vml" xmlns:w10="urn:schemas-microsoft-com:office:word" xmlns:w14="http://schemas.microsoft.com/office/word/2010/wordml" xmlns:w="http://schemas.openxmlformats.org/wordprocessingml/2006/main" xmlns:wne="http://schemas.microsoft.com/office/word/2006/wordml" xmlns:wp14="http://schemas.microsoft.com/office/word/2010/wordprocessingDrawing" xmlns:wp="http://schemas.openxmlformats.org/drawingml/2006/wordprocessingDrawing" xmlns:wpc="http://schemas.microsoft.com/office/word/2010/wordprocessingCanvas" xmlns:wpg="http://schemas.microsoft.com/office/word/2010/wordprocessingGroup" xmlns:wpi="http://schemas.microsoft.com/office/word/2010/wordprocessingInk" xmlns:wps="http://schemas.microsoft.com/office/word/2010/wordprocessingShape" mc:Ignorable="w14 wp14">
+  <w:p>
+    <w:pPr>
+      <w:pStyle w:val="Footer"/>
+      <w:jc w:val="center"/>
+    </w:pPr>
+    <w:r>
+      <w:rPr>
+        <w:rFonts w:ascii="Times New Roman" w:hAnsi="Times New Roman" w:cs="Times New Roman" w:eastAsia="Times New Roman"/>
+        <w:sz w:val="20"/>
+      </w:rPr>
+      <w:t>Sánchez Insfrán: Preprint submitted to Elsevier</w:t>
+    </w:r>
+  </w:p>
+</w:ftr>
 </file>
 
 <file path=word/footnotes.xml><?xml version="1.0" encoding="utf-8"?>
@@ -1036,6 +1631,13 @@
   <w:style w:default="1" w:styleId="Normal" w:type="paragraph">
     <w:name w:val="Normal"/>
     <w:qFormat/>
+    <w:pPr>
+      <w:spacing w:line="480" w:lineRule="auto"/>
+    </w:pPr>
+    <w:rPr>
+      <w:rFonts w:ascii="Times New Roman" w:hAnsi="Times New Roman"/>
+      <w:sz w:val="20"/>
+    </w:rPr>
   </w:style>
   <w:style w:styleId="BodyText" w:type="paragraph">
     <w:name w:val="Body Text"/>
@@ -1043,22 +1645,37 @@
     <w:link w:val="BodyTextChar"/>
     <w:qFormat/>
     <w:pPr>
-      <w:spacing w:after="180" w:before="180"/>
+      <w:spacing w:after="180" w:before="180" w:line="480" w:lineRule="auto"/>
     </w:pPr>
+    <w:rPr>
+      <w:rFonts w:ascii="Times New Roman" w:hAnsi="Times New Roman"/>
+      <w:sz w:val="20"/>
+    </w:rPr>
   </w:style>
   <w:style w:customStyle="1" w:styleId="FirstParagraph" w:type="paragraph">
     <w:name w:val="First Paragraph"/>
     <w:basedOn w:val="BodyText"/>
     <w:next w:val="BodyText"/>
     <w:qFormat/>
+    <w:pPr>
+      <w:spacing w:line="480" w:lineRule="auto"/>
+    </w:pPr>
+    <w:rPr>
+      <w:rFonts w:ascii="Times New Roman" w:hAnsi="Times New Roman"/>
+      <w:sz w:val="20"/>
+    </w:rPr>
   </w:style>
   <w:style w:customStyle="1" w:styleId="Compact" w:type="paragraph">
     <w:name w:val="Compact"/>
     <w:basedOn w:val="BodyText"/>
     <w:qFormat/>
     <w:pPr>
-      <w:spacing w:after="36" w:before="36"/>
+      <w:spacing w:after="36" w:before="36" w:line="480" w:lineRule="auto"/>
     </w:pPr>
+    <w:rPr>
+      <w:rFonts w:ascii="Times New Roman" w:hAnsi="Times New Roman"/>
+      <w:sz w:val="20"/>
+    </w:rPr>
   </w:style>
   <w:style w:styleId="Title" w:type="paragraph">
     <w:name w:val="Title"/>
@@ -1069,13 +1686,14 @@
     <w:qFormat/>
     <w:rsid w:val="00A10FD9"/>
     <w:pPr>
-      <w:spacing w:after="80" w:line="240" w:lineRule="auto"/>
+      <w:spacing w:after="80" w:line="480" w:lineRule="auto"/>
       <w:contextualSpacing/>
       <w:jc w:val="center"/>
     </w:pPr>
     <w:rPr>
-      <w:rFonts w:asciiTheme="majorHAnsi" w:cstheme="majorBidi" w:eastAsiaTheme="majorEastAsia" w:hAnsiTheme="majorHAnsi"/>
-      <w:sz w:val="56"/>
+      <w:rFonts w:asciiTheme="majorHAnsi" w:cstheme="majorBidi" w:eastAsiaTheme="majorEastAsia" w:hAnsiTheme="majorHAnsi" w:ascii="Times New Roman" w:hAnsi="Times New Roman"/>
+      <w:b w:val="0"/>
+      <w:sz w:val="28"/>
       <w:szCs w:val="56"/>
     </w:rPr>
   </w:style>
@@ -1133,9 +1751,11 @@
     <w:pPr>
       <w:keepNext/>
       <w:keepLines/>
+      <w:spacing w:line="480" w:lineRule="auto"/>
     </w:pPr>
     <w:rPr>
-      <w:sz w:val="24"/>
+      <w:rFonts w:ascii="Times New Roman" w:hAnsi="Times New Roman"/>
+      <w:sz w:val="20"/>
       <w:szCs w:val="24"/>
     </w:rPr>
   </w:style>
@@ -1147,9 +1767,11 @@
     <w:pPr>
       <w:keepNext/>
       <w:keepLines/>
+      <w:spacing w:line="480" w:lineRule="auto"/>
     </w:pPr>
     <w:rPr>
-      <w:sz w:val="24"/>
+      <w:rFonts w:ascii="Times New Roman" w:hAnsi="Times New Roman"/>
+      <w:sz w:val="20"/>
       <w:szCs w:val="24"/>
     </w:rPr>
   </w:style>
@@ -1204,13 +1826,14 @@
     <w:pPr>
       <w:keepNext/>
       <w:keepLines/>
-      <w:spacing w:after="80" w:before="360"/>
+      <w:spacing w:after="80" w:before="360" w:line="480" w:lineRule="auto"/>
       <w:outlineLvl w:val="0"/>
     </w:pPr>
     <w:rPr>
-      <w:rFonts w:asciiTheme="majorHAnsi" w:cstheme="majorBidi" w:eastAsiaTheme="majorEastAsia" w:hAnsiTheme="majorHAnsi"/>
+      <w:rFonts w:asciiTheme="majorHAnsi" w:cstheme="majorBidi" w:eastAsiaTheme="majorEastAsia" w:hAnsiTheme="majorHAnsi" w:ascii="Times New Roman" w:hAnsi="Times New Roman"/>
+      <w:b w:val="0"/>
       <w:color w:themeColor="accent1" w:themeShade="BF" w:val="0F4761"/>
-      <w:sz w:val="40"/>
+      <w:sz w:val="28"/>
       <w:szCs w:val="40"/>
     </w:rPr>
   </w:style>

</xml_diff>

<commit_message>
fix: corrige tablas y disponibilidad de envío
Ajusta Table 3 y las tablas anchas del suplemento para que sean legibles en DOCX, repara los epígrafes de los maestros y sincroniza la disponibilidad de datos v2.0.1, el release v2.1.0 y el contenido S1–S11.
</commit_message>
<xml_diff>
--- a/entregables/cover_letter.docx
+++ b/entregables/cover_letter.docx
@@ -7,10 +7,6 @@
         <w:pStyle w:val="Title"/>
       </w:pPr>
       <w:r>
-        <w:rPr>
-          <w:rFonts w:ascii="Times New Roman" w:hAnsi="Times New Roman" w:cs="Times New Roman" w:eastAsia="Times New Roman"/>
-          <w:sz w:val="28"/>
-        </w:rPr>
         <w:t xml:space="preserve">Cover Letter to the Editor-in-Chief</w:t>
       </w:r>
     </w:p>
@@ -19,142 +15,85 @@
         <w:pStyle w:val="Date"/>
       </w:pPr>
       <w:r>
-        <w:rPr>
-          <w:rFonts w:ascii="Times New Roman" w:hAnsi="Times New Roman" w:cs="Times New Roman" w:eastAsia="Times New Roman"/>
-          <w:sz w:val="20"/>
-        </w:rPr>
         <w:t xml:space="preserve">2026-10-28</w:t>
       </w:r>
     </w:p>
     <w:p>
       <w:pPr>
         <w:pStyle w:val="FirstParagraph"/>
-        <w:spacing w:line="480" w:lineRule="auto"/>
-      </w:pPr>
-      <w:r>
-        <w:rPr>
-          <w:rFonts w:ascii="Times New Roman" w:hAnsi="Times New Roman" w:cs="Times New Roman" w:eastAsia="Times New Roman"/>
-          <w:b/>
-          <w:bCs/>
-          <w:sz w:val="20"/>
+      </w:pPr>
+      <w:r>
+        <w:rPr>
+          <w:b/>
+          <w:bCs/>
         </w:rPr>
         <w:t xml:space="preserve">Date:</w:t>
       </w:r>
       <w:r>
-        <w:rPr>
-          <w:rFonts w:ascii="Times New Roman" w:hAnsi="Times New Roman" w:cs="Times New Roman" w:eastAsia="Times New Roman"/>
-          <w:sz w:val="20"/>
-        </w:rPr>
-        <w:t xml:space="preserve"> </w:t>
-      </w:r>
-      <w:r>
-        <w:rPr>
-          <w:rFonts w:ascii="Times New Roman" w:hAnsi="Times New Roman" w:cs="Times New Roman" w:eastAsia="Times New Roman"/>
-          <w:sz w:val="20"/>
-        </w:rPr>
+        <w:t xml:space="preserve"> </w:t>
+      </w:r>
+      <w:r>
         <w:t xml:space="preserve">October 28, 2026</w:t>
       </w:r>
     </w:p>
     <w:p>
       <w:pPr>
         <w:pStyle w:val="BodyText"/>
-        <w:spacing w:line="480" w:lineRule="auto"/>
-      </w:pPr>
-      <w:r>
-        <w:rPr>
-          <w:rFonts w:ascii="Times New Roman" w:hAnsi="Times New Roman" w:cs="Times New Roman" w:eastAsia="Times New Roman"/>
-          <w:b/>
-          <w:bCs/>
-          <w:sz w:val="20"/>
+      </w:pPr>
+      <w:r>
+        <w:rPr>
+          <w:b/>
+          <w:bCs/>
         </w:rPr>
         <w:t xml:space="preserve">To:</w:t>
       </w:r>
       <w:r>
-        <w:rPr>
-          <w:rFonts w:ascii="Times New Roman" w:hAnsi="Times New Roman" w:cs="Times New Roman" w:eastAsia="Times New Roman"/>
-          <w:sz w:val="20"/>
-        </w:rPr>
         <w:br/>
       </w:r>
       <w:r>
-        <w:rPr>
-          <w:rFonts w:ascii="Times New Roman" w:hAnsi="Times New Roman" w:cs="Times New Roman" w:eastAsia="Times New Roman"/>
-          <w:sz w:val="20"/>
-        </w:rPr>
         <w:t xml:space="preserve">The Editors-in-Chief</w:t>
       </w:r>
       <w:r>
-        <w:rPr>
-          <w:rFonts w:ascii="Times New Roman" w:hAnsi="Times New Roman" w:cs="Times New Roman" w:eastAsia="Times New Roman"/>
-          <w:sz w:val="20"/>
-        </w:rPr>
         <w:br/>
       </w:r>
       <w:r>
         <w:rPr>
-          <w:rFonts w:ascii="Times New Roman" w:hAnsi="Times New Roman" w:cs="Times New Roman" w:eastAsia="Times New Roman"/>
           <w:i/>
           <w:iCs/>
-          <w:sz w:val="20"/>
         </w:rPr>
         <w:t xml:space="preserve">Computers &amp; Geosciences</w:t>
       </w:r>
       <w:r>
-        <w:rPr>
-          <w:rFonts w:ascii="Times New Roman" w:hAnsi="Times New Roman" w:cs="Times New Roman" w:eastAsia="Times New Roman"/>
-          <w:sz w:val="20"/>
-        </w:rPr>
         <w:br/>
       </w:r>
       <w:r>
-        <w:rPr>
-          <w:rFonts w:ascii="Times New Roman" w:hAnsi="Times New Roman" w:cs="Times New Roman" w:eastAsia="Times New Roman"/>
-          <w:sz w:val="20"/>
-        </w:rPr>
         <w:t xml:space="preserve">Elsevier Science</w:t>
       </w:r>
     </w:p>
     <w:p>
       <w:pPr>
         <w:pStyle w:val="BodyText"/>
-        <w:spacing w:line="480" w:lineRule="auto"/>
-      </w:pPr>
-      <w:r>
-        <w:rPr>
-          <w:rFonts w:ascii="Times New Roman" w:hAnsi="Times New Roman" w:cs="Times New Roman" w:eastAsia="Times New Roman"/>
-          <w:b/>
-          <w:bCs/>
-          <w:sz w:val="20"/>
+      </w:pPr>
+      <w:r>
+        <w:rPr>
+          <w:b/>
+          <w:bCs/>
         </w:rPr>
         <w:t xml:space="preserve">Subject:</w:t>
       </w:r>
       <w:r>
-        <w:rPr>
-          <w:rFonts w:ascii="Times New Roman" w:hAnsi="Times New Roman" w:cs="Times New Roman" w:eastAsia="Times New Roman"/>
-          <w:sz w:val="20"/>
-        </w:rPr>
-        <w:t xml:space="preserve"> </w:t>
-      </w:r>
-      <w:r>
-        <w:rPr>
-          <w:rFonts w:ascii="Times New Roman" w:hAnsi="Times New Roman" w:cs="Times New Roman" w:eastAsia="Times New Roman"/>
-          <w:sz w:val="20"/>
-        </w:rPr>
+        <w:t xml:space="preserve"> </w:t>
+      </w:r>
+      <w:r>
         <w:t xml:space="preserve">Submission of original research paper titled</w:t>
       </w:r>
       <w:r>
-        <w:rPr>
-          <w:rFonts w:ascii="Times New Roman" w:hAnsi="Times New Roman" w:cs="Times New Roman" w:eastAsia="Times New Roman"/>
-          <w:sz w:val="20"/>
-        </w:rPr>
-        <w:t xml:space="preserve"> </w:t>
-      </w:r>
-      <w:r>
-        <w:rPr>
-          <w:rFonts w:ascii="Times New Roman" w:hAnsi="Times New Roman" w:cs="Times New Roman" w:eastAsia="Times New Roman"/>
+        <w:t xml:space="preserve"> </w:t>
+      </w:r>
+      <w:r>
+        <w:rPr>
           <w:i/>
           <w:iCs/>
-          <w:sz w:val="20"/>
         </w:rPr>
         <w:t xml:space="preserve">“A Reproducible Computational Framework for Decoupled Wildfire Ignition and Propagation Benchmarking in the Gran Chaco (2018–2025)”</w:t>
       </w:r>
@@ -162,115 +101,66 @@
     <w:p>
       <w:pPr>
         <w:pStyle w:val="BodyText"/>
-        <w:spacing w:line="480" w:lineRule="auto"/>
-      </w:pPr>
-      <w:r>
-        <w:rPr>
-          <w:rFonts w:ascii="Times New Roman" w:hAnsi="Times New Roman" w:cs="Times New Roman" w:eastAsia="Times New Roman"/>
-          <w:sz w:val="20"/>
-        </w:rPr>
+      </w:pPr>
+      <w:r>
         <w:t xml:space="preserve">Dear Editors-in-Chief,</w:t>
       </w:r>
     </w:p>
     <w:p>
       <w:pPr>
         <w:pStyle w:val="BodyText"/>
-        <w:spacing w:line="480" w:lineRule="auto"/>
-      </w:pPr>
-      <w:r>
-        <w:rPr>
-          <w:rFonts w:ascii="Times New Roman" w:hAnsi="Times New Roman" w:cs="Times New Roman" w:eastAsia="Times New Roman"/>
-          <w:sz w:val="20"/>
-        </w:rPr>
+      </w:pPr>
+      <w:r>
         <w:t xml:space="preserve">Please find enclosed my original research manuscript entitled</w:t>
       </w:r>
       <w:r>
-        <w:rPr>
-          <w:rFonts w:ascii="Times New Roman" w:hAnsi="Times New Roman" w:cs="Times New Roman" w:eastAsia="Times New Roman"/>
-          <w:sz w:val="20"/>
-        </w:rPr>
-        <w:t xml:space="preserve"> </w:t>
-      </w:r>
-      <w:r>
-        <w:rPr>
-          <w:rFonts w:ascii="Times New Roman" w:hAnsi="Times New Roman" w:cs="Times New Roman" w:eastAsia="Times New Roman"/>
-          <w:b/>
-          <w:bCs/>
-          <w:sz w:val="20"/>
+        <w:t xml:space="preserve"> </w:t>
+      </w:r>
+      <w:r>
+        <w:rPr>
+          <w:b/>
+          <w:bCs/>
         </w:rPr>
         <w:t xml:space="preserve">“A Reproducible Computational Framework for Decoupled Wildfire Ignition and Propagation Benchmarking in the Gran Chaco (2018–2025): D2 Targets, M3/M2 Inference and an Open Benchmark Against Canadian FWI and INPE”</w:t>
       </w:r>
       <w:r>
-        <w:rPr>
-          <w:rFonts w:ascii="Times New Roman" w:hAnsi="Times New Roman" w:cs="Times New Roman" w:eastAsia="Times New Roman"/>
-          <w:sz w:val="20"/>
-        </w:rPr>
         <w:t xml:space="preserve">, which I submit for consideration as a</w:t>
       </w:r>
       <w:r>
-        <w:rPr>
-          <w:rFonts w:ascii="Times New Roman" w:hAnsi="Times New Roman" w:cs="Times New Roman" w:eastAsia="Times New Roman"/>
-          <w:sz w:val="20"/>
-        </w:rPr>
-        <w:t xml:space="preserve"> </w:t>
-      </w:r>
-      <w:r>
-        <w:rPr>
-          <w:rFonts w:ascii="Times New Roman" w:hAnsi="Times New Roman" w:cs="Times New Roman" w:eastAsia="Times New Roman"/>
-          <w:b/>
-          <w:bCs/>
-          <w:sz w:val="20"/>
+        <w:t xml:space="preserve"> </w:t>
+      </w:r>
+      <w:r>
+        <w:rPr>
+          <w:b/>
+          <w:bCs/>
         </w:rPr>
         <w:t xml:space="preserve">Research Paper</w:t>
       </w:r>
       <w:r>
-        <w:rPr>
-          <w:rFonts w:ascii="Times New Roman" w:hAnsi="Times New Roman" w:cs="Times New Roman" w:eastAsia="Times New Roman"/>
-          <w:sz w:val="20"/>
-        </w:rPr>
-        <w:t xml:space="preserve"> </w:t>
-      </w:r>
-      <w:r>
-        <w:rPr>
-          <w:rFonts w:ascii="Times New Roman" w:hAnsi="Times New Roman" w:cs="Times New Roman" w:eastAsia="Times New Roman"/>
-          <w:sz w:val="20"/>
-        </w:rPr>
+        <w:t xml:space="preserve"> </w:t>
+      </w:r>
+      <w:r>
         <w:t xml:space="preserve">in</w:t>
       </w:r>
       <w:r>
-        <w:rPr>
-          <w:rFonts w:ascii="Times New Roman" w:hAnsi="Times New Roman" w:cs="Times New Roman" w:eastAsia="Times New Roman"/>
-          <w:sz w:val="20"/>
-        </w:rPr>
-        <w:t xml:space="preserve"> </w:t>
-      </w:r>
-      <w:r>
-        <w:rPr>
-          <w:rFonts w:ascii="Times New Roman" w:hAnsi="Times New Roman" w:cs="Times New Roman" w:eastAsia="Times New Roman"/>
+        <w:t xml:space="preserve"> </w:t>
+      </w:r>
+      <w:r>
+        <w:rPr>
           <w:i/>
           <w:iCs/>
-          <w:sz w:val="20"/>
         </w:rPr>
         <w:t xml:space="preserve">Computers &amp; Geosciences</w:t>
       </w:r>
       <w:r>
-        <w:rPr>
-          <w:rFonts w:ascii="Times New Roman" w:hAnsi="Times New Roman" w:cs="Times New Roman" w:eastAsia="Times New Roman"/>
-          <w:sz w:val="20"/>
-        </w:rPr>
         <w:t xml:space="preserve">.</w:t>
       </w:r>
     </w:p>
     <w:p>
       <w:pPr>
         <w:pStyle w:val="BodyText"/>
-        <w:spacing w:line="480" w:lineRule="auto"/>
-      </w:pPr>
-      <w:r>
-        <w:rPr>
-          <w:rFonts w:ascii="Times New Roman" w:hAnsi="Times New Roman" w:cs="Times New Roman" w:eastAsia="Times New Roman"/>
-          <w:sz w:val="20"/>
-        </w:rPr>
+      </w:pPr>
+      <w:r>
         <w:t xml:space="preserve">The manuscript presents an auditable computational protocol and reproducible software infrastructure, rather than a regional machine-learning case study. Its central contribution is the formal D2 target operator, the gated M3/M2 inference policy and the open evaluation harness; the learner is deliberately replaceable.</w:t>
       </w:r>
     </w:p>
@@ -280,245 +170,133 @@
         <w:pStyle w:val="Heading3"/>
       </w:pPr>
       <w:r>
-        <w:rPr>
-          <w:rFonts w:ascii="Times New Roman" w:hAnsi="Times New Roman" w:cs="Times New Roman" w:eastAsia="Times New Roman"/>
-          <w:sz w:val="20"/>
-        </w:rPr>
         <w:t xml:space="preserve">Motivation and Core Scientific Novelty</w:t>
       </w:r>
     </w:p>
     <w:p>
       <w:pPr>
         <w:pStyle w:val="FirstParagraph"/>
-        <w:spacing w:line="480" w:lineRule="auto"/>
-      </w:pPr>
-      <w:r>
-        <w:rPr>
-          <w:rFonts w:ascii="Times New Roman" w:hAnsi="Times New Roman" w:cs="Times New Roman" w:eastAsia="Times New Roman"/>
-          <w:sz w:val="20"/>
-        </w:rPr>
+      </w:pPr>
+      <w:r>
         <w:t xml:space="preserve">Operational wildfire forecasting in geoscience machine learning frequently suffers from two pervasive methodological pathologies:</w:t>
       </w:r>
       <w:r>
-        <w:rPr>
-          <w:rFonts w:ascii="Times New Roman" w:hAnsi="Times New Roman" w:cs="Times New Roman" w:eastAsia="Times New Roman"/>
-          <w:sz w:val="20"/>
-        </w:rPr>
-        <w:t xml:space="preserve"> </w:t>
-      </w:r>
-      <w:r>
-        <w:rPr>
-          <w:rFonts w:ascii="Times New Roman" w:hAnsi="Times New Roman" w:cs="Times New Roman" w:eastAsia="Times New Roman"/>
-          <w:sz w:val="20"/>
-        </w:rPr>
+        <w:t xml:space="preserve"> </w:t>
+      </w:r>
+      <w:r>
         <w:t xml:space="preserve">1.</w:t>
       </w:r>
       <w:r>
-        <w:rPr>
-          <w:rFonts w:ascii="Times New Roman" w:hAnsi="Times New Roman" w:cs="Times New Roman" w:eastAsia="Times New Roman"/>
-          <w:sz w:val="20"/>
-        </w:rPr>
-        <w:t xml:space="preserve"> </w:t>
-      </w:r>
-      <w:r>
-        <w:rPr>
-          <w:rFonts w:ascii="Times New Roman" w:hAnsi="Times New Roman" w:cs="Times New Roman" w:eastAsia="Times New Roman"/>
-          <w:b/>
-          <w:bCs/>
-          <w:sz w:val="20"/>
+        <w:t xml:space="preserve"> </w:t>
+      </w:r>
+      <w:r>
+        <w:rPr>
+          <w:b/>
+          <w:bCs/>
         </w:rPr>
         <w:t xml:space="preserve">Spatial Shortcut Learning:</w:t>
       </w:r>
       <w:r>
-        <w:rPr>
-          <w:rFonts w:ascii="Times New Roman" w:hAnsi="Times New Roman" w:cs="Times New Roman" w:eastAsia="Times New Roman"/>
-          <w:sz w:val="20"/>
-        </w:rPr>
-        <w:t xml:space="preserve"> </w:t>
-      </w:r>
-      <w:r>
-        <w:rPr>
-          <w:rFonts w:ascii="Times New Roman" w:hAnsi="Times New Roman" w:cs="Times New Roman" w:eastAsia="Times New Roman"/>
-          <w:sz w:val="20"/>
-        </w:rPr>
+        <w:t xml:space="preserve"> </w:t>
+      </w:r>
+      <w:r>
         <w:t xml:space="preserve">When models include autoregressive spatial lags without isolating causal mechanisms, gradient-boosted ensembles learn trivial spatial persistence heuristics (</w:t>
       </w:r>
       <w:r>
         <w:rPr>
-          <w:rFonts w:ascii="Times New Roman" w:hAnsi="Times New Roman" w:cs="Times New Roman" w:eastAsia="Times New Roman"/>
           <w:i/>
           <w:iCs/>
-          <w:sz w:val="20"/>
         </w:rPr>
         <w:t xml:space="preserve">“fire will persist where thermal anomalies already exist”</w:t>
       </w:r>
       <w:r>
-        <w:rPr>
-          <w:rFonts w:ascii="Times New Roman" w:hAnsi="Times New Roman" w:cs="Times New Roman" w:eastAsia="Times New Roman"/>
-          <w:sz w:val="20"/>
-        </w:rPr>
         <w:t xml:space="preserve">), resulting in severe false confidence while remaining incapable of anticipating new, spontaneous, or anthropic primary ignitions.</w:t>
       </w:r>
       <w:r>
-        <w:rPr>
-          <w:rFonts w:ascii="Times New Roman" w:hAnsi="Times New Roman" w:cs="Times New Roman" w:eastAsia="Times New Roman"/>
-          <w:sz w:val="20"/>
-        </w:rPr>
-        <w:t xml:space="preserve"> </w:t>
-      </w:r>
-      <w:r>
-        <w:rPr>
-          <w:rFonts w:ascii="Times New Roman" w:hAnsi="Times New Roman" w:cs="Times New Roman" w:eastAsia="Times New Roman"/>
-          <w:sz w:val="20"/>
-        </w:rPr>
+        <w:t xml:space="preserve"> </w:t>
+      </w:r>
+      <w:r>
         <w:t xml:space="preserve">2.</w:t>
       </w:r>
       <w:r>
-        <w:rPr>
-          <w:rFonts w:ascii="Times New Roman" w:hAnsi="Times New Roman" w:cs="Times New Roman" w:eastAsia="Times New Roman"/>
-          <w:sz w:val="20"/>
-        </w:rPr>
-        <w:t xml:space="preserve"> </w:t>
-      </w:r>
-      <w:r>
-        <w:rPr>
-          <w:rFonts w:ascii="Times New Roman" w:hAnsi="Times New Roman" w:cs="Times New Roman" w:eastAsia="Times New Roman"/>
-          <w:b/>
-          <w:bCs/>
-          <w:sz w:val="20"/>
+        <w:t xml:space="preserve"> </w:t>
+      </w:r>
+      <w:r>
+        <w:rPr>
+          <w:b/>
+          <w:bCs/>
         </w:rPr>
         <w:t xml:space="preserve">Failure of Canonical Boreal Indices in the Subtropics:</w:t>
       </w:r>
       <w:r>
-        <w:rPr>
-          <w:rFonts w:ascii="Times New Roman" w:hAnsi="Times New Roman" w:cs="Times New Roman" w:eastAsia="Times New Roman"/>
-          <w:sz w:val="20"/>
-        </w:rPr>
-        <w:t xml:space="preserve"> </w:t>
-      </w:r>
-      <w:r>
-        <w:rPr>
-          <w:rFonts w:ascii="Times New Roman" w:hAnsi="Times New Roman" w:cs="Times New Roman" w:eastAsia="Times New Roman"/>
-          <w:sz w:val="20"/>
-        </w:rPr>
+        <w:t xml:space="preserve"> </w:t>
+      </w:r>
+      <w:r>
         <w:t xml:space="preserve">Widely deployed operational frameworks—such as the Canadian Forest Fire Weather Index (FWI) used by EFFIS/GWIS and the CPTEC/INPE Risco de Fogo—consistently fail or invert hazard rankings in water-limited subtropical biomes (e.g., the South American Gran Chaco), where vapor pressure deficit (VPD) and non-linear fuel-curing dynamics govern fire risk.</w:t>
       </w:r>
     </w:p>
     <w:p>
       <w:pPr>
         <w:pStyle w:val="BodyText"/>
-        <w:spacing w:line="480" w:lineRule="auto"/>
-      </w:pPr>
-      <w:r>
-        <w:rPr>
-          <w:rFonts w:ascii="Times New Roman" w:hAnsi="Times New Roman" w:cs="Times New Roman" w:eastAsia="Times New Roman"/>
-          <w:sz w:val="20"/>
-        </w:rPr>
+      </w:pPr>
+      <w:r>
         <w:t xml:space="preserve">To address these challenges, I introduce</w:t>
       </w:r>
       <w:r>
-        <w:rPr>
-          <w:rFonts w:ascii="Times New Roman" w:hAnsi="Times New Roman" w:cs="Times New Roman" w:eastAsia="Times New Roman"/>
-          <w:sz w:val="20"/>
-        </w:rPr>
         <w:t xml:space="preserve"> </w:t>
       </w:r>
       <w:r>
         <w:rPr>
           <w:rStyle w:val="VerbatimChar"/>
-          <w:rFonts w:ascii="Times New Roman" w:hAnsi="Times New Roman" w:cs="Times New Roman" w:eastAsia="Times New Roman"/>
-          <w:sz w:val="20"/>
         </w:rPr>
         <w:t xml:space="preserve">Incendios_PY</w:t>
       </w:r>
       <w:r>
-        <w:rPr>
-          <w:rFonts w:ascii="Times New Roman" w:hAnsi="Times New Roman" w:cs="Times New Roman" w:eastAsia="Times New Roman"/>
-          <w:sz w:val="20"/>
-        </w:rPr>
         <w:t xml:space="preserve">, an open-source computational framework for reproducible decoupled wildfire modeling across</w:t>
       </w:r>
       <w:r>
-        <w:rPr>
-          <w:rFonts w:ascii="Times New Roman" w:hAnsi="Times New Roman" w:cs="Times New Roman" w:eastAsia="Times New Roman"/>
-          <w:sz w:val="20"/>
-        </w:rPr>
-        <w:t xml:space="preserve"> </w:t>
-      </w:r>
-      <w:r>
-        <w:rPr>
-          <w:rFonts w:ascii="Times New Roman" w:hAnsi="Times New Roman" w:cs="Times New Roman" w:eastAsia="Times New Roman"/>
-          <w:b/>
-          <w:bCs/>
-          <w:sz w:val="20"/>
+        <w:t xml:space="preserve"> </w:t>
+      </w:r>
+      <w:r>
+        <w:rPr>
+          <w:b/>
+          <w:bCs/>
         </w:rPr>
         <w:t xml:space="preserve">400 006 1-km² grid cells</w:t>
       </w:r>
       <w:r>
-        <w:rPr>
-          <w:rFonts w:ascii="Times New Roman" w:hAnsi="Times New Roman" w:cs="Times New Roman" w:eastAsia="Times New Roman"/>
-          <w:sz w:val="20"/>
-        </w:rPr>
-        <w:t xml:space="preserve"> </w:t>
-      </w:r>
-      <w:r>
-        <w:rPr>
-          <w:rFonts w:ascii="Times New Roman" w:hAnsi="Times New Roman" w:cs="Times New Roman" w:eastAsia="Times New Roman"/>
-          <w:sz w:val="20"/>
-        </w:rPr>
+        <w:t xml:space="preserve"> </w:t>
+      </w:r>
+      <w:r>
         <w:t xml:space="preserve">over an 8-year multi-annual observation baseline (2018–2025). This horizon is anchored to the multi-sensor VIIRS 375 m constellation (Suomi-NPP, NOAA-20 and NOAA-21), which reduces single-sensor sampling bias across the modeling phases. The framework analytically decouples the operational task into two distinct models: (i)</w:t>
       </w:r>
       <w:r>
-        <w:rPr>
-          <w:rFonts w:ascii="Times New Roman" w:hAnsi="Times New Roman" w:cs="Times New Roman" w:eastAsia="Times New Roman"/>
-          <w:sz w:val="20"/>
-        </w:rPr>
-        <w:t xml:space="preserve"> </w:t>
-      </w:r>
-      <w:r>
-        <w:rPr>
-          <w:rFonts w:ascii="Times New Roman" w:hAnsi="Times New Roman" w:cs="Times New Roman" w:eastAsia="Times New Roman"/>
-          <w:b/>
-          <w:bCs/>
-          <w:sz w:val="20"/>
+        <w:t xml:space="preserve"> </w:t>
+      </w:r>
+      <w:r>
+        <w:rPr>
+          <w:b/>
+          <w:bCs/>
         </w:rPr>
         <w:t xml:space="preserve">Multiscale Socio-Ecological Hybrid Ignition</w:t>
       </w:r>
       <w:r>
-        <w:rPr>
-          <w:rFonts w:ascii="Times New Roman" w:hAnsi="Times New Roman" w:cs="Times New Roman" w:eastAsia="Times New Roman"/>
-          <w:sz w:val="20"/>
-        </w:rPr>
-        <w:t xml:space="preserve"> </w:t>
-      </w:r>
-      <w:r>
-        <w:rPr>
-          <w:rFonts w:ascii="Times New Roman" w:hAnsi="Times New Roman" w:cs="Times New Roman" w:eastAsia="Times New Roman"/>
-          <w:sz w:val="20"/>
-        </w:rPr>
+        <w:t xml:space="preserve"> </w:t>
+      </w:r>
+      <w:r>
         <w:t xml:space="preserve">(M3), guided by physics-based monotonic constraints, ecotone edge gradients, and static anthropogenic priors at 10-km and 25-km scales; and (ii)</w:t>
       </w:r>
       <w:r>
-        <w:rPr>
-          <w:rFonts w:ascii="Times New Roman" w:hAnsi="Times New Roman" w:cs="Times New Roman" w:eastAsia="Times New Roman"/>
-          <w:sz w:val="20"/>
-        </w:rPr>
-        <w:t xml:space="preserve"> </w:t>
-      </w:r>
-      <w:r>
-        <w:rPr>
-          <w:rFonts w:ascii="Times New Roman" w:hAnsi="Times New Roman" w:cs="Times New Roman" w:eastAsia="Times New Roman"/>
-          <w:b/>
-          <w:bCs/>
-          <w:sz w:val="20"/>
+        <w:t xml:space="preserve"> </w:t>
+      </w:r>
+      <w:r>
+        <w:rPr>
+          <w:b/>
+          <w:bCs/>
         </w:rPr>
         <w:t xml:space="preserve">Tactical Propagation</w:t>
       </w:r>
       <w:r>
-        <w:rPr>
-          <w:rFonts w:ascii="Times New Roman" w:hAnsi="Times New Roman" w:cs="Times New Roman" w:eastAsia="Times New Roman"/>
-          <w:sz w:val="20"/>
-        </w:rPr>
         <w:t xml:space="preserve">, driven by a causal spatial contagion kernel at lag t−1.</w:t>
       </w:r>
     </w:p>
@@ -529,25 +307,15 @@
         <w:pStyle w:val="Heading3"/>
       </w:pPr>
       <w:r>
-        <w:rPr>
-          <w:rFonts w:ascii="Times New Roman" w:hAnsi="Times New Roman" w:cs="Times New Roman" w:eastAsia="Times New Roman"/>
-          <w:sz w:val="20"/>
-        </w:rPr>
         <w:t xml:space="preserve">Why this Manuscript Fits</w:t>
       </w:r>
       <w:r>
-        <w:rPr>
-          <w:rFonts w:ascii="Times New Roman" w:hAnsi="Times New Roman" w:cs="Times New Roman" w:eastAsia="Times New Roman"/>
-          <w:sz w:val="20"/>
-        </w:rPr>
-        <w:t xml:space="preserve"> </w:t>
-      </w:r>
-      <w:r>
-        <w:rPr>
-          <w:rFonts w:ascii="Times New Roman" w:hAnsi="Times New Roman" w:cs="Times New Roman" w:eastAsia="Times New Roman"/>
+        <w:t xml:space="preserve"> </w:t>
+      </w:r>
+      <w:r>
+        <w:rPr>
           <w:i/>
           <w:iCs/>
-          <w:sz w:val="20"/>
         </w:rPr>
         <w:t xml:space="preserve">Computers &amp; Geosciences</w:t>
       </w:r>
@@ -555,66 +323,37 @@
     <w:p>
       <w:pPr>
         <w:pStyle w:val="FirstParagraph"/>
-        <w:spacing w:line="480" w:lineRule="auto"/>
-      </w:pPr>
-      <w:r>
-        <w:rPr>
-          <w:rFonts w:ascii="Times New Roman" w:hAnsi="Times New Roman" w:cs="Times New Roman" w:eastAsia="Times New Roman"/>
-          <w:sz w:val="20"/>
-        </w:rPr>
+      </w:pPr>
+      <w:r>
         <w:t xml:space="preserve">My work sits precisely at the convergence of</w:t>
       </w:r>
       <w:r>
-        <w:rPr>
-          <w:rFonts w:ascii="Times New Roman" w:hAnsi="Times New Roman" w:cs="Times New Roman" w:eastAsia="Times New Roman"/>
-          <w:sz w:val="20"/>
-        </w:rPr>
-        <w:t xml:space="preserve"> </w:t>
-      </w:r>
-      <w:r>
-        <w:rPr>
-          <w:rFonts w:ascii="Times New Roman" w:hAnsi="Times New Roman" w:cs="Times New Roman" w:eastAsia="Times New Roman"/>
-          <w:b/>
-          <w:bCs/>
-          <w:sz w:val="20"/>
+        <w:t xml:space="preserve"> </w:t>
+      </w:r>
+      <w:r>
+        <w:rPr>
+          <w:b/>
+          <w:bCs/>
         </w:rPr>
         <w:t xml:space="preserve">Computer Science Applications</w:t>
       </w:r>
       <w:r>
-        <w:rPr>
-          <w:rFonts w:ascii="Times New Roman" w:hAnsi="Times New Roman" w:cs="Times New Roman" w:eastAsia="Times New Roman"/>
-          <w:sz w:val="20"/>
-        </w:rPr>
-        <w:t xml:space="preserve"> </w:t>
-      </w:r>
-      <w:r>
-        <w:rPr>
-          <w:rFonts w:ascii="Times New Roman" w:hAnsi="Times New Roman" w:cs="Times New Roman" w:eastAsia="Times New Roman"/>
-          <w:sz w:val="20"/>
-        </w:rPr>
+        <w:t xml:space="preserve"> </w:t>
+      </w:r>
+      <w:r>
         <w:t xml:space="preserve">and</w:t>
       </w:r>
       <w:r>
-        <w:rPr>
-          <w:rFonts w:ascii="Times New Roman" w:hAnsi="Times New Roman" w:cs="Times New Roman" w:eastAsia="Times New Roman"/>
-          <w:sz w:val="20"/>
-        </w:rPr>
-        <w:t xml:space="preserve"> </w:t>
-      </w:r>
-      <w:r>
-        <w:rPr>
-          <w:rFonts w:ascii="Times New Roman" w:hAnsi="Times New Roman" w:cs="Times New Roman" w:eastAsia="Times New Roman"/>
-          <w:b/>
-          <w:bCs/>
-          <w:sz w:val="20"/>
+        <w:t xml:space="preserve"> </w:t>
+      </w:r>
+      <w:r>
+        <w:rPr>
+          <w:b/>
+          <w:bCs/>
         </w:rPr>
         <w:t xml:space="preserve">Earth and Planetary Sciences</w:t>
       </w:r>
       <w:r>
-        <w:rPr>
-          <w:rFonts w:ascii="Times New Roman" w:hAnsi="Times New Roman" w:cs="Times New Roman" w:eastAsia="Times New Roman"/>
-          <w:sz w:val="20"/>
-        </w:rPr>
         <w:t xml:space="preserve">. The computational contribution is the D2 target operator, the gated M3/M2 inference policy and a reusable evaluation harness, released as documented software. The learner is replaceable; the novelty lies in the computational contract.</w:t>
       </w:r>
     </w:p>
@@ -625,59 +364,34 @@
           <w:ilvl w:val="0"/>
           <w:numId w:val="1001"/>
         </w:numPr>
-        <w:spacing w:line="480" w:lineRule="auto"/>
-      </w:pPr>
-      <w:r>
-        <w:rPr>
-          <w:rFonts w:ascii="Times New Roman" w:hAnsi="Times New Roman" w:cs="Times New Roman" w:eastAsia="Times New Roman"/>
-          <w:b/>
-          <w:bCs/>
-          <w:sz w:val="20"/>
+      </w:pPr>
+      <w:r>
+        <w:rPr>
+          <w:b/>
+          <w:bCs/>
         </w:rPr>
         <w:t xml:space="preserve">High-Performance Columnar Computational Pipeline:</w:t>
       </w:r>
       <w:r>
-        <w:rPr>
-          <w:rFonts w:ascii="Times New Roman" w:hAnsi="Times New Roman" w:cs="Times New Roman" w:eastAsia="Times New Roman"/>
-          <w:sz w:val="20"/>
-        </w:rPr>
-        <w:t xml:space="preserve"> </w:t>
-      </w:r>
-      <w:r>
-        <w:rPr>
-          <w:rFonts w:ascii="Times New Roman" w:hAnsi="Times New Roman" w:cs="Times New Roman" w:eastAsia="Times New Roman"/>
-          <w:sz w:val="20"/>
-        </w:rPr>
+        <w:t xml:space="preserve"> </w:t>
+      </w:r>
+      <w:r>
         <w:t xml:space="preserve">By integrating Apache Arrow, DuckDB, and Polars, the inference engine processes the entire national territory (400 006 km²) in</w:t>
       </w:r>
       <w:r>
-        <w:rPr>
-          <w:rFonts w:ascii="Times New Roman" w:hAnsi="Times New Roman" w:cs="Times New Roman" w:eastAsia="Times New Roman"/>
-          <w:sz w:val="20"/>
-        </w:rPr>
-        <w:t xml:space="preserve"> </w:t>
-      </w:r>
-      <w:r>
-        <w:rPr>
-          <w:rFonts w:ascii="Times New Roman" w:hAnsi="Times New Roman" w:cs="Times New Roman" w:eastAsia="Times New Roman"/>
-          <w:b/>
-          <w:bCs/>
-          <w:sz w:val="20"/>
+        <w:t xml:space="preserve"> </w:t>
+      </w:r>
+      <w:r>
+        <w:rPr>
+          <w:b/>
+          <w:bCs/>
         </w:rPr>
         <w:t xml:space="preserve">~3.47 seconds</w:t>
       </w:r>
       <w:r>
-        <w:rPr>
-          <w:rFonts w:ascii="Times New Roman" w:hAnsi="Times New Roman" w:cs="Times New Roman" w:eastAsia="Times New Roman"/>
-          <w:sz w:val="20"/>
-        </w:rPr>
-        <w:t xml:space="preserve"> </w:t>
-      </w:r>
-      <w:r>
-        <w:rPr>
-          <w:rFonts w:ascii="Times New Roman" w:hAnsi="Times New Roman" w:cs="Times New Roman" w:eastAsia="Times New Roman"/>
-          <w:sz w:val="20"/>
-        </w:rPr>
+        <w:t xml:space="preserve"> </w:t>
+      </w:r>
+      <w:r>
         <w:t xml:space="preserve">on a standard ARM64 machine (~2.21 GB peak RAM), demonstrating that national early-warning systems do not require prohibitive cloud infrastructure.</w:t>
       </w:r>
     </w:p>
@@ -688,29 +402,18 @@
           <w:ilvl w:val="0"/>
           <w:numId w:val="1001"/>
         </w:numPr>
-        <w:spacing w:line="480" w:lineRule="auto"/>
-      </w:pPr>
-      <w:r>
-        <w:rPr>
-          <w:rFonts w:ascii="Times New Roman" w:hAnsi="Times New Roman" w:cs="Times New Roman" w:eastAsia="Times New Roman"/>
-          <w:b/>
-          <w:bCs/>
-          <w:sz w:val="20"/>
+      </w:pPr>
+      <w:r>
+        <w:rPr>
+          <w:b/>
+          <w:bCs/>
         </w:rPr>
         <w:t xml:space="preserve">Physics-Guided Machine Learning (PGML):</w:t>
       </w:r>
       <w:r>
-        <w:rPr>
-          <w:rFonts w:ascii="Times New Roman" w:hAnsi="Times New Roman" w:cs="Times New Roman" w:eastAsia="Times New Roman"/>
-          <w:sz w:val="20"/>
-        </w:rPr>
-        <w:t xml:space="preserve"> </w:t>
-      </w:r>
-      <w:r>
-        <w:rPr>
-          <w:rFonts w:ascii="Times New Roman" w:hAnsi="Times New Roman" w:cs="Times New Roman" w:eastAsia="Times New Roman"/>
-          <w:sz w:val="20"/>
-        </w:rPr>
+        <w:t xml:space="preserve"> </w:t>
+      </w:r>
+      <w:r>
         <w:t xml:space="preserve">The framework enforces structural monotonic constraints within LightGBM (+1 for atmospheric dryness and wind pressure, −1 for antecedent rainfall and distance), mathematically preventing counterintuitive artifacts.</w:t>
       </w:r>
     </w:p>
@@ -721,82 +424,47 @@
           <w:ilvl w:val="0"/>
           <w:numId w:val="1001"/>
         </w:numPr>
-        <w:spacing w:line="480" w:lineRule="auto"/>
-      </w:pPr>
-      <w:r>
-        <w:rPr>
-          <w:rFonts w:ascii="Times New Roman" w:hAnsi="Times New Roman" w:cs="Times New Roman" w:eastAsia="Times New Roman"/>
-          <w:b/>
-          <w:bCs/>
-          <w:sz w:val="20"/>
+      </w:pPr>
+      <w:r>
+        <w:rPr>
+          <w:b/>
+          <w:bCs/>
         </w:rPr>
         <w:t xml:space="preserve">Spatial and Temporal Control:</w:t>
       </w:r>
       <w:r>
-        <w:rPr>
-          <w:rFonts w:ascii="Times New Roman" w:hAnsi="Times New Roman" w:cs="Times New Roman" w:eastAsia="Times New Roman"/>
-          <w:sz w:val="20"/>
-        </w:rPr>
-        <w:t xml:space="preserve"> </w:t>
-      </w:r>
-      <w:r>
-        <w:rPr>
-          <w:rFonts w:ascii="Times New Roman" w:hAnsi="Times New Roman" w:cs="Times New Roman" w:eastAsia="Times New Roman"/>
-          <w:sz w:val="20"/>
-        </w:rPr>
+        <w:t xml:space="preserve"> </w:t>
+      </w:r>
+      <w:r>
         <w:t xml:space="preserve">The study uses the</w:t>
       </w:r>
       <w:r>
-        <w:rPr>
-          <w:rFonts w:ascii="Times New Roman" w:hAnsi="Times New Roman" w:cs="Times New Roman" w:eastAsia="Times New Roman"/>
-          <w:sz w:val="20"/>
-        </w:rPr>
-        <w:t xml:space="preserve"> </w:t>
-      </w:r>
-      <w:r>
-        <w:rPr>
-          <w:rFonts w:ascii="Times New Roman" w:hAnsi="Times New Roman" w:cs="Times New Roman" w:eastAsia="Times New Roman"/>
-          <w:b/>
-          <w:bCs/>
-          <w:sz w:val="20"/>
+        <w:t xml:space="preserve"> </w:t>
+      </w:r>
+      <w:r>
+        <w:rPr>
+          <w:b/>
+          <w:bCs/>
         </w:rPr>
         <w:t xml:space="preserve">D2 target definition</w:t>
       </w:r>
       <w:r>
-        <w:rPr>
-          <w:rFonts w:ascii="Times New Roman" w:hAnsi="Times New Roman" w:cs="Times New Roman" w:eastAsia="Times New Roman"/>
-          <w:sz w:val="20"/>
-        </w:rPr>
-        <w:t xml:space="preserve"> </w:t>
-      </w:r>
-      <w:r>
-        <w:rPr>
-          <w:rFonts w:ascii="Times New Roman" w:hAnsi="Times New Roman" w:cs="Times New Roman" w:eastAsia="Times New Roman"/>
-          <w:sz w:val="20"/>
-        </w:rPr>
+        <w:t xml:space="preserve"> </w:t>
+      </w:r>
+      <w:r>
         <w:t xml:space="preserve">(no t-1 fire within 25 km; no same-cell fire in 10 days) and multi-year out-of-time test partitions (2024–2025). The framework also implements a</w:t>
       </w:r>
       <w:r>
-        <w:rPr>
-          <w:rFonts w:ascii="Times New Roman" w:hAnsi="Times New Roman" w:cs="Times New Roman" w:eastAsia="Times New Roman"/>
-          <w:sz w:val="20"/>
-        </w:rPr>
-        <w:t xml:space="preserve"> </w:t>
-      </w:r>
-      <w:r>
-        <w:rPr>
-          <w:rFonts w:ascii="Times New Roman" w:hAnsi="Times New Roman" w:cs="Times New Roman" w:eastAsia="Times New Roman"/>
-          <w:b/>
-          <w:bCs/>
-          <w:sz w:val="20"/>
+        <w:t xml:space="preserve"> </w:t>
+      </w:r>
+      <w:r>
+        <w:rPr>
+          <w:b/>
+          <w:bCs/>
         </w:rPr>
         <w:t xml:space="preserve">50-km spatial block holdout with a 20-km buffer</w:t>
       </w:r>
       <w:r>
-        <w:rPr>
-          <w:rFonts w:ascii="Times New Roman" w:hAnsi="Times New Roman" w:cs="Times New Roman" w:eastAsia="Times New Roman"/>
-          <w:sz w:val="20"/>
-        </w:rPr>
         <w:t xml:space="preserve">. Priors are causal (monthly cutoff, rolling 3-year window).</w:t>
       </w:r>
     </w:p>
@@ -807,104 +475,61 @@
           <w:ilvl w:val="0"/>
           <w:numId w:val="1001"/>
         </w:numPr>
-        <w:spacing w:line="480" w:lineRule="auto"/>
-      </w:pPr>
-      <w:r>
-        <w:rPr>
-          <w:rFonts w:ascii="Times New Roman" w:hAnsi="Times New Roman" w:cs="Times New Roman" w:eastAsia="Times New Roman"/>
-          <w:b/>
-          <w:bCs/>
-          <w:sz w:val="20"/>
+      </w:pPr>
+      <w:r>
+        <w:rPr>
+          <w:b/>
+          <w:bCs/>
         </w:rPr>
         <w:t xml:space="preserve">Software Engineering and Reproducibility Standards:</w:t>
       </w:r>
       <w:r>
-        <w:rPr>
-          <w:rFonts w:ascii="Times New Roman" w:hAnsi="Times New Roman" w:cs="Times New Roman" w:eastAsia="Times New Roman"/>
-          <w:sz w:val="20"/>
-        </w:rPr>
-        <w:t xml:space="preserve"> </w:t>
-      </w:r>
-      <w:r>
-        <w:rPr>
-          <w:rFonts w:ascii="Times New Roman" w:hAnsi="Times New Roman" w:cs="Times New Roman" w:eastAsia="Times New Roman"/>
-          <w:sz w:val="20"/>
-        </w:rPr>
+        <w:t xml:space="preserve"> </w:t>
+      </w:r>
+      <w:r>
         <w:t xml:space="preserve">The framework is packaged with a complete automated test suite of</w:t>
       </w:r>
       <w:r>
-        <w:rPr>
-          <w:rFonts w:ascii="Times New Roman" w:hAnsi="Times New Roman" w:cs="Times New Roman" w:eastAsia="Times New Roman"/>
-          <w:sz w:val="20"/>
-        </w:rPr>
-        <w:t xml:space="preserve"> </w:t>
-      </w:r>
-      <w:r>
-        <w:rPr>
-          <w:rFonts w:ascii="Times New Roman" w:hAnsi="Times New Roman" w:cs="Times New Roman" w:eastAsia="Times New Roman"/>
-          <w:b/>
-          <w:bCs/>
-          <w:sz w:val="20"/>
+        <w:t xml:space="preserve"> </w:t>
+      </w:r>
+      <w:r>
+        <w:rPr>
+          <w:b/>
+          <w:bCs/>
         </w:rPr>
         <w:t xml:space="preserve">76 unit tests</w:t>
       </w:r>
       <w:r>
-        <w:rPr>
-          <w:rFonts w:ascii="Times New Roman" w:hAnsi="Times New Roman" w:cs="Times New Roman" w:eastAsia="Times New Roman"/>
-          <w:sz w:val="20"/>
-        </w:rPr>
-        <w:t xml:space="preserve"> </w:t>
-      </w:r>
-      <w:r>
-        <w:rPr>
-          <w:rFonts w:ascii="Times New Roman" w:hAnsi="Times New Roman" w:cs="Times New Roman" w:eastAsia="Times New Roman"/>
-          <w:sz w:val="20"/>
-        </w:rPr>
+        <w:t xml:space="preserve"> </w:t>
+      </w:r>
+      <w:r>
         <w:t xml:space="preserve">(</w:t>
       </w:r>
       <w:r>
         <w:rPr>
           <w:rStyle w:val="VerbatimChar"/>
-          <w:rFonts w:ascii="Times New Roman" w:hAnsi="Times New Roman" w:cs="Times New Roman" w:eastAsia="Times New Roman"/>
-          <w:sz w:val="20"/>
         </w:rPr>
         <w:t xml:space="preserve">tests/</w:t>
       </w:r>
       <w:r>
-        <w:rPr>
-          <w:rFonts w:ascii="Times New Roman" w:hAnsi="Times New Roman" w:cs="Times New Roman" w:eastAsia="Times New Roman"/>
-          <w:sz w:val="20"/>
-        </w:rPr>
         <w:t xml:space="preserve">) running in ≈1 minute, verifying algebraic invariants, physical monotonicity, conformal coverage, and spatial KD-Tree queries. All code and workflows are versioned from raw ingestion (</w:t>
       </w:r>
       <w:r>
         <w:rPr>
           <w:rStyle w:val="VerbatimChar"/>
-          <w:rFonts w:ascii="Times New Roman" w:hAnsi="Times New Roman" w:cs="Times New Roman" w:eastAsia="Times New Roman"/>
-          <w:sz w:val="20"/>
         </w:rPr>
         <w:t xml:space="preserve">scripts/00_...</w:t>
       </w:r>
       <w:r>
-        <w:rPr>
-          <w:rFonts w:ascii="Times New Roman" w:hAnsi="Times New Roman" w:cs="Times New Roman" w:eastAsia="Times New Roman"/>
-          <w:sz w:val="20"/>
-        </w:rPr>
         <w:t xml:space="preserve">) to release and validation outputs (</w:t>
       </w:r>
       <w:r>
         <w:rPr>
           <w:rStyle w:val="VerbatimChar"/>
-          <w:rFonts w:ascii="Times New Roman" w:hAnsi="Times New Roman" w:cs="Times New Roman" w:eastAsia="Times New Roman"/>
-          <w:sz w:val="20"/>
         </w:rPr>
         <w:t xml:space="preserve">scripts/34_...</w:t>
       </w:r>
       <w:r>
-        <w:rPr>
-          <w:rFonts w:ascii="Times New Roman" w:hAnsi="Times New Roman" w:cs="Times New Roman" w:eastAsia="Times New Roman"/>
-          <w:sz w:val="20"/>
-        </w:rPr>
         <w:t xml:space="preserve">) under the permissive MIT License.</w:t>
       </w:r>
     </w:p>
@@ -915,179 +540,98 @@
           <w:ilvl w:val="0"/>
           <w:numId w:val="1001"/>
         </w:numPr>
-        <w:spacing w:line="480" w:lineRule="auto"/>
-      </w:pPr>
-      <w:r>
-        <w:rPr>
-          <w:rFonts w:ascii="Times New Roman" w:hAnsi="Times New Roman" w:cs="Times New Roman" w:eastAsia="Times New Roman"/>
-          <w:b/>
-          <w:bCs/>
-          <w:sz w:val="20"/>
+      </w:pPr>
+      <w:r>
+        <w:rPr>
+          <w:b/>
+          <w:bCs/>
         </w:rPr>
         <w:t xml:space="preserve">Quantitative International Benchmarking:</w:t>
       </w:r>
       <w:r>
-        <w:rPr>
-          <w:rFonts w:ascii="Times New Roman" w:hAnsi="Times New Roman" w:cs="Times New Roman" w:eastAsia="Times New Roman"/>
-          <w:sz w:val="20"/>
-        </w:rPr>
-        <w:t xml:space="preserve"> </w:t>
-      </w:r>
-      <w:r>
-        <w:rPr>
-          <w:rFonts w:ascii="Times New Roman" w:hAnsi="Times New Roman" w:cs="Times New Roman" w:eastAsia="Times New Roman"/>
-          <w:sz w:val="20"/>
-        </w:rPr>
+        <w:t xml:space="preserve"> </w:t>
+      </w:r>
+      <w:r>
         <w:t xml:space="preserve">In retrospective temporal testing over 1 813 966 D2 cell-days during 2024–2025, the hybrid ignition layer M3 achieves a ROC-AUC of</w:t>
       </w:r>
       <w:r>
-        <w:rPr>
-          <w:rFonts w:ascii="Times New Roman" w:hAnsi="Times New Roman" w:cs="Times New Roman" w:eastAsia="Times New Roman"/>
-          <w:sz w:val="20"/>
-        </w:rPr>
-        <w:t xml:space="preserve"> </w:t>
-      </w:r>
-      <w:r>
-        <w:rPr>
-          <w:rFonts w:ascii="Times New Roman" w:hAnsi="Times New Roman" w:cs="Times New Roman" w:eastAsia="Times New Roman"/>
-          <w:b/>
-          <w:bCs/>
-          <w:sz w:val="20"/>
+        <w:t xml:space="preserve"> </w:t>
+      </w:r>
+      <w:r>
+        <w:rPr>
+          <w:b/>
+          <w:bCs/>
         </w:rPr>
         <w:t xml:space="preserve">0.8021</w:t>
       </w:r>
       <w:r>
-        <w:rPr>
-          <w:rFonts w:ascii="Times New Roman" w:hAnsi="Times New Roman" w:cs="Times New Roman" w:eastAsia="Times New Roman"/>
-          <w:sz w:val="20"/>
-        </w:rPr>
-        <w:t xml:space="preserve"> </w:t>
-      </w:r>
-      <w:r>
-        <w:rPr>
-          <w:rFonts w:ascii="Times New Roman" w:hAnsi="Times New Roman" w:cs="Times New Roman" w:eastAsia="Times New Roman"/>
-          <w:sz w:val="20"/>
-        </w:rPr>
+        <w:t xml:space="preserve"> </w:t>
+      </w:r>
+      <w:r>
         <w:t xml:space="preserve">in the Gran Chaco and</w:t>
       </w:r>
       <w:r>
-        <w:rPr>
-          <w:rFonts w:ascii="Times New Roman" w:hAnsi="Times New Roman" w:cs="Times New Roman" w:eastAsia="Times New Roman"/>
-          <w:sz w:val="20"/>
-        </w:rPr>
-        <w:t xml:space="preserve"> </w:t>
-      </w:r>
-      <w:r>
-        <w:rPr>
-          <w:rFonts w:ascii="Times New Roman" w:hAnsi="Times New Roman" w:cs="Times New Roman" w:eastAsia="Times New Roman"/>
-          <w:b/>
-          <w:bCs/>
-          <w:sz w:val="20"/>
+        <w:t xml:space="preserve"> </w:t>
+      </w:r>
+      <w:r>
+        <w:rPr>
+          <w:b/>
+          <w:bCs/>
         </w:rPr>
         <w:t xml:space="preserve">0.7534</w:t>
       </w:r>
       <w:r>
-        <w:rPr>
-          <w:rFonts w:ascii="Times New Roman" w:hAnsi="Times New Roman" w:cs="Times New Roman" w:eastAsia="Times New Roman"/>
-          <w:sz w:val="20"/>
-        </w:rPr>
-        <w:t xml:space="preserve"> </w:t>
-      </w:r>
-      <w:r>
-        <w:rPr>
-          <w:rFonts w:ascii="Times New Roman" w:hAnsi="Times New Roman" w:cs="Times New Roman" w:eastAsia="Times New Roman"/>
-          <w:sz w:val="20"/>
-        </w:rPr>
+        <w:t xml:space="preserve"> </w:t>
+      </w:r>
+      <w:r>
         <w:t xml:space="preserve">in the Oriental Region, versus</w:t>
       </w:r>
       <w:r>
-        <w:rPr>
-          <w:rFonts w:ascii="Times New Roman" w:hAnsi="Times New Roman" w:cs="Times New Roman" w:eastAsia="Times New Roman"/>
-          <w:sz w:val="20"/>
-        </w:rPr>
-        <w:t xml:space="preserve"> </w:t>
-      </w:r>
-      <w:r>
-        <w:rPr>
-          <w:rFonts w:ascii="Times New Roman" w:hAnsi="Times New Roman" w:cs="Times New Roman" w:eastAsia="Times New Roman"/>
-          <w:b/>
-          <w:bCs/>
-          <w:sz w:val="20"/>
+        <w:t xml:space="preserve"> </w:t>
+      </w:r>
+      <w:r>
+        <w:rPr>
+          <w:b/>
+          <w:bCs/>
         </w:rPr>
         <w:t xml:space="preserve">0.5059 / 0.5611</w:t>
       </w:r>
       <w:r>
-        <w:rPr>
-          <w:rFonts w:ascii="Times New Roman" w:hAnsi="Times New Roman" w:cs="Times New Roman" w:eastAsia="Times New Roman"/>
-          <w:sz w:val="20"/>
-        </w:rPr>
-        <w:t xml:space="preserve"> </w:t>
-      </w:r>
-      <w:r>
-        <w:rPr>
-          <w:rFonts w:ascii="Times New Roman" w:hAnsi="Times New Roman" w:cs="Times New Roman" w:eastAsia="Times New Roman"/>
-          <w:sz w:val="20"/>
-        </w:rPr>
+        <w:t xml:space="preserve"> </w:t>
+      </w:r>
+      <w:r>
         <w:t xml:space="preserve">for the full Canadian FWI and</w:t>
       </w:r>
       <w:r>
-        <w:rPr>
-          <w:rFonts w:ascii="Times New Roman" w:hAnsi="Times New Roman" w:cs="Times New Roman" w:eastAsia="Times New Roman"/>
-          <w:sz w:val="20"/>
-        </w:rPr>
-        <w:t xml:space="preserve"> </w:t>
-      </w:r>
-      <w:r>
-        <w:rPr>
-          <w:rFonts w:ascii="Times New Roman" w:hAnsi="Times New Roman" w:cs="Times New Roman" w:eastAsia="Times New Roman"/>
-          <w:b/>
-          <w:bCs/>
-          <w:sz w:val="20"/>
+        <w:t xml:space="preserve"> </w:t>
+      </w:r>
+      <w:r>
+        <w:rPr>
+          <w:b/>
+          <w:bCs/>
         </w:rPr>
         <w:t xml:space="preserve">0.5266 / 0.4973</w:t>
       </w:r>
       <w:r>
-        <w:rPr>
-          <w:rFonts w:ascii="Times New Roman" w:hAnsi="Times New Roman" w:cs="Times New Roman" w:eastAsia="Times New Roman"/>
-          <w:sz w:val="20"/>
-        </w:rPr>
-        <w:t xml:space="preserve"> </w:t>
-      </w:r>
-      <w:r>
-        <w:rPr>
-          <w:rFonts w:ascii="Times New Roman" w:hAnsi="Times New Roman" w:cs="Times New Roman" w:eastAsia="Times New Roman"/>
-          <w:sz w:val="20"/>
-        </w:rPr>
+        <w:t xml:space="preserve"> </w:t>
+      </w:r>
+      <w:r>
         <w:t xml:space="preserve">for the INPE. Case-control F0.5 precision is 32.82 % / 30.13 %; after correction to population prevalence (~0.015 % / 0.041 %), operational precision is 0.082 % / 0.198 %. Tactical propagation achieves ROC-AUC</w:t>
       </w:r>
       <w:r>
-        <w:rPr>
-          <w:rFonts w:ascii="Times New Roman" w:hAnsi="Times New Roman" w:cs="Times New Roman" w:eastAsia="Times New Roman"/>
-          <w:sz w:val="20"/>
-        </w:rPr>
-        <w:t xml:space="preserve"> </w:t>
-      </w:r>
-      <w:r>
-        <w:rPr>
-          <w:rFonts w:ascii="Times New Roman" w:hAnsi="Times New Roman" w:cs="Times New Roman" w:eastAsia="Times New Roman"/>
-          <w:b/>
-          <w:bCs/>
-          <w:sz w:val="20"/>
+        <w:t xml:space="preserve"> </w:t>
+      </w:r>
+      <w:r>
+        <w:rPr>
+          <w:b/>
+          <w:bCs/>
         </w:rPr>
         <w:t xml:space="preserve">0.9039</w:t>
       </w:r>
       <w:r>
-        <w:rPr>
-          <w:rFonts w:ascii="Times New Roman" w:hAnsi="Times New Roman" w:cs="Times New Roman" w:eastAsia="Times New Roman"/>
-          <w:sz w:val="20"/>
-        </w:rPr>
-        <w:t xml:space="preserve"> </w:t>
-      </w:r>
-      <w:r>
-        <w:rPr>
-          <w:rFonts w:ascii="Times New Roman" w:hAnsi="Times New Roman" w:cs="Times New Roman" w:eastAsia="Times New Roman"/>
-          <w:sz w:val="20"/>
-        </w:rPr>
+        <w:t xml:space="preserve"> </w:t>
+      </w:r>
+      <w:r>
         <w:t xml:space="preserve">(Chaco) and population precision 9.67 %. The 2023 validation selected M3 for temporal nowcasting and M2 as the operational fallback; M1 was rejected as a fallback. These corrected metrics are the honest operational benchmark.</w:t>
       </w:r>
     </w:p>
@@ -1098,10 +642,6 @@
         <w:pStyle w:val="Heading3"/>
       </w:pPr>
       <w:r>
-        <w:rPr>
-          <w:rFonts w:ascii="Times New Roman" w:hAnsi="Times New Roman" w:cs="Times New Roman" w:eastAsia="Times New Roman"/>
-          <w:sz w:val="20"/>
-        </w:rPr>
         <w:t xml:space="preserve">Mandatory Declarations</w:t>
       </w:r>
     </w:p>
@@ -1112,13 +652,8 @@
           <w:ilvl w:val="0"/>
           <w:numId w:val="1002"/>
         </w:numPr>
-        <w:spacing w:line="480" w:lineRule="auto"/>
-      </w:pPr>
-      <w:r>
-        <w:rPr>
-          <w:rFonts w:ascii="Times New Roman" w:hAnsi="Times New Roman" w:cs="Times New Roman" w:eastAsia="Times New Roman"/>
-          <w:sz w:val="20"/>
-        </w:rPr>
+      </w:pPr>
+      <w:r>
         <w:t xml:space="preserve">This manuscript has not been published previously, is not under consideration for publication elsewhere, and its publication has been approved by the author.</w:t>
       </w:r>
     </w:p>
@@ -1129,51 +664,39 @@
           <w:ilvl w:val="0"/>
           <w:numId w:val="1002"/>
         </w:numPr>
-        <w:spacing w:line="480" w:lineRule="auto"/>
-      </w:pPr>
-      <w:r>
-        <w:rPr>
-          <w:rFonts w:ascii="Times New Roman" w:hAnsi="Times New Roman" w:cs="Times New Roman" w:eastAsia="Times New Roman"/>
-          <w:sz w:val="20"/>
-        </w:rPr>
+      </w:pPr>
+      <w:r>
         <w:t xml:space="preserve">All source code and reproduction scripts are openly hosted on GitHub (</w:t>
       </w:r>
       <w:r>
         <w:rPr>
           <w:rStyle w:val="VerbatimChar"/>
-          <w:rFonts w:ascii="Times New Roman" w:hAnsi="Times New Roman" w:cs="Times New Roman" w:eastAsia="Times New Roman"/>
-          <w:sz w:val="20"/>
         </w:rPr>
         <w:t xml:space="preserve">https://github.com/sanchezmartin093-code/Incendios_PY</w:t>
       </w:r>
       <w:r>
-        <w:rPr>
-          <w:rFonts w:ascii="Times New Roman" w:hAnsi="Times New Roman" w:cs="Times New Roman" w:eastAsia="Times New Roman"/>
-          <w:sz w:val="20"/>
-        </w:rPr>
         <w:t xml:space="preserve">). Processed data and trained models are documented with SHA-256 hashes in</w:t>
       </w:r>
       <w:r>
-        <w:rPr>
-          <w:rFonts w:ascii="Times New Roman" w:hAnsi="Times New Roman" w:cs="Times New Roman" w:eastAsia="Times New Roman"/>
-          <w:sz w:val="20"/>
-        </w:rPr>
         <w:t xml:space="preserve"> </w:t>
       </w:r>
       <w:r>
         <w:rPr>
           <w:rStyle w:val="VerbatimChar"/>
-          <w:rFonts w:ascii="Times New Roman" w:hAnsi="Times New Roman" w:cs="Times New Roman" w:eastAsia="Times New Roman"/>
-          <w:sz w:val="20"/>
         </w:rPr>
         <w:t xml:space="preserve">fuentes/MANIFIESTO_DATOS_v3.csv</w:t>
       </w:r>
       <w:r>
-        <w:rPr>
-          <w:rFonts w:ascii="Times New Roman" w:hAnsi="Times New Roman" w:cs="Times New Roman" w:eastAsia="Times New Roman"/>
-          <w:sz w:val="20"/>
-        </w:rPr>
-        <w:t xml:space="preserve">, available in the v2.1.0 GitHub release, and indexed by the code and data concept DOIs (10.5281/zenodo.23675104; 10.5281/zenodo.23675278).</w:t>
+        <w:t xml:space="preserve">, archived in the v2.0.1 data release asset (</w:t>
+      </w:r>
+      <w:r>
+        <w:rPr>
+          <w:rStyle w:val="VerbatimChar"/>
+        </w:rPr>
+        <w:t xml:space="preserve">Incendios_PY_data_v2.0.1.zip</w:t>
+      </w:r>
+      <w:r>
+        <w:t xml:space="preserve">, 1.18 GB), and indexed by the code and data concept DOIs (10.5281/zenodo.23675104; 10.5281/zenodo.23675278). The v2.1.0 code release is on GitHub.</w:t>
       </w:r>
     </w:p>
     <w:p>
@@ -1183,103 +706,57 @@
           <w:ilvl w:val="0"/>
           <w:numId w:val="1002"/>
         </w:numPr>
-        <w:spacing w:line="480" w:lineRule="auto"/>
-      </w:pPr>
-      <w:r>
-        <w:rPr>
-          <w:rFonts w:ascii="Times New Roman" w:hAnsi="Times New Roman" w:cs="Times New Roman" w:eastAsia="Times New Roman"/>
-          <w:sz w:val="20"/>
-        </w:rPr>
+      </w:pPr>
+      <w:r>
         <w:t xml:space="preserve">I declare no competing financial or non-financial conflicts of interest.</w:t>
       </w:r>
     </w:p>
     <w:p>
       <w:pPr>
         <w:pStyle w:val="FirstParagraph"/>
-        <w:spacing w:line="480" w:lineRule="auto"/>
-      </w:pPr>
-      <w:r>
-        <w:rPr>
-          <w:rFonts w:ascii="Times New Roman" w:hAnsi="Times New Roman" w:cs="Times New Roman" w:eastAsia="Times New Roman"/>
-          <w:sz w:val="20"/>
-        </w:rPr>
+      </w:pPr>
+      <w:r>
         <w:t xml:space="preserve">Thank you very much for your time, consideration, and editorial guidance.</w:t>
       </w:r>
     </w:p>
     <w:p>
       <w:pPr>
         <w:pStyle w:val="BodyText"/>
-        <w:spacing w:line="480" w:lineRule="auto"/>
-      </w:pPr>
-      <w:r>
-        <w:rPr>
-          <w:rFonts w:ascii="Times New Roman" w:hAnsi="Times New Roman" w:cs="Times New Roman" w:eastAsia="Times New Roman"/>
-          <w:sz w:val="20"/>
-        </w:rPr>
+      </w:pPr>
+      <w:r>
         <w:t xml:space="preserve">Sincerely,</w:t>
       </w:r>
     </w:p>
     <w:p>
       <w:pPr>
         <w:pStyle w:val="BodyText"/>
-        <w:spacing w:line="480" w:lineRule="auto"/>
-      </w:pPr>
-      <w:r>
-        <w:rPr>
-          <w:rFonts w:ascii="Times New Roman" w:hAnsi="Times New Roman" w:cs="Times New Roman" w:eastAsia="Times New Roman"/>
-          <w:b/>
-          <w:bCs/>
-          <w:sz w:val="20"/>
+      </w:pPr>
+      <w:r>
+        <w:rPr>
+          <w:b/>
+          <w:bCs/>
         </w:rPr>
         <w:t xml:space="preserve">Martín Sánchez Insfrán, MD</w:t>
       </w:r>
       <w:r>
-        <w:rPr>
-          <w:rFonts w:ascii="Times New Roman" w:hAnsi="Times New Roman" w:cs="Times New Roman" w:eastAsia="Times New Roman"/>
-          <w:sz w:val="20"/>
-        </w:rPr>
         <w:br/>
       </w:r>
       <w:r>
-        <w:rPr>
-          <w:rFonts w:ascii="Times New Roman" w:hAnsi="Times New Roman" w:cs="Times New Roman" w:eastAsia="Times New Roman"/>
-          <w:sz w:val="20"/>
-        </w:rPr>
         <w:t xml:space="preserve">Independent Researcher / Surgeon</w:t>
       </w:r>
       <w:r>
-        <w:rPr>
-          <w:rFonts w:ascii="Times New Roman" w:hAnsi="Times New Roman" w:cs="Times New Roman" w:eastAsia="Times New Roman"/>
-          <w:sz w:val="20"/>
-        </w:rPr>
         <w:br/>
       </w:r>
       <w:r>
-        <w:rPr>
-          <w:rFonts w:ascii="Times New Roman" w:hAnsi="Times New Roman" w:cs="Times New Roman" w:eastAsia="Times New Roman"/>
-          <w:sz w:val="20"/>
-        </w:rPr>
         <w:t xml:space="preserve">Asunción, Republic of Paraguay</w:t>
       </w:r>
       <w:r>
-        <w:rPr>
-          <w:rFonts w:ascii="Times New Roman" w:hAnsi="Times New Roman" w:cs="Times New Roman" w:eastAsia="Times New Roman"/>
-          <w:sz w:val="20"/>
-        </w:rPr>
         <w:br/>
       </w:r>
       <w:r>
-        <w:rPr>
-          <w:rFonts w:ascii="Times New Roman" w:hAnsi="Times New Roman" w:cs="Times New Roman" w:eastAsia="Times New Roman"/>
-          <w:sz w:val="20"/>
-        </w:rPr>
         <w:t xml:space="preserve">ORCID:</w:t>
       </w:r>
       <w:r>
-        <w:rPr>
-          <w:rFonts w:ascii="Times New Roman" w:hAnsi="Times New Roman" w:cs="Times New Roman" w:eastAsia="Times New Roman"/>
-          <w:sz w:val="20"/>
-        </w:rPr>
         <w:t xml:space="preserve"> </w:t>
       </w:r>
       <w:hyperlink r:id="rId11">
@@ -1291,67 +768,33 @@
         </w:r>
       </w:hyperlink>
       <w:r>
-        <w:rPr>
-          <w:rFonts w:ascii="Times New Roman" w:hAnsi="Times New Roman" w:cs="Times New Roman" w:eastAsia="Times New Roman"/>
-          <w:sz w:val="20"/>
-        </w:rPr>
         <w:br/>
       </w:r>
       <w:r>
-        <w:rPr>
-          <w:rFonts w:ascii="Times New Roman" w:hAnsi="Times New Roman" w:cs="Times New Roman" w:eastAsia="Times New Roman"/>
-          <w:sz w:val="20"/>
-        </w:rPr>
         <w:t xml:space="preserve">Email:</w:t>
       </w:r>
       <w:r>
-        <w:rPr>
-          <w:rFonts w:ascii="Times New Roman" w:hAnsi="Times New Roman" w:cs="Times New Roman" w:eastAsia="Times New Roman"/>
-          <w:sz w:val="20"/>
-        </w:rPr>
         <w:t xml:space="preserve"> </w:t>
       </w:r>
       <w:r>
         <w:rPr>
           <w:rStyle w:val="VerbatimChar"/>
-          <w:rFonts w:ascii="Times New Roman" w:hAnsi="Times New Roman" w:cs="Times New Roman" w:eastAsia="Times New Roman"/>
-          <w:sz w:val="20"/>
         </w:rPr>
         <w:t xml:space="preserve">sanchez.martin093@gmail.com</w:t>
       </w:r>
       <w:r>
-        <w:rPr>
-          <w:rFonts w:ascii="Times New Roman" w:hAnsi="Times New Roman" w:cs="Times New Roman" w:eastAsia="Times New Roman"/>
-          <w:sz w:val="20"/>
-        </w:rPr>
         <w:br/>
       </w:r>
       <w:r>
-        <w:rPr>
-          <w:rFonts w:ascii="Times New Roman" w:hAnsi="Times New Roman" w:cs="Times New Roman" w:eastAsia="Times New Roman"/>
-          <w:sz w:val="20"/>
-        </w:rPr>
         <w:t xml:space="preserve">Phone: +595 971 907 727</w:t>
       </w:r>
       <w:r>
-        <w:rPr>
-          <w:rFonts w:ascii="Times New Roman" w:hAnsi="Times New Roman" w:cs="Times New Roman" w:eastAsia="Times New Roman"/>
-          <w:sz w:val="20"/>
-        </w:rPr>
         <w:br/>
       </w:r>
       <w:r>
-        <w:rPr>
-          <w:rFonts w:ascii="Times New Roman" w:hAnsi="Times New Roman" w:cs="Times New Roman" w:eastAsia="Times New Roman"/>
-          <w:sz w:val="20"/>
-        </w:rPr>
         <w:t xml:space="preserve">Code Repository:</w:t>
       </w:r>
       <w:r>
-        <w:rPr>
-          <w:rFonts w:ascii="Times New Roman" w:hAnsi="Times New Roman" w:cs="Times New Roman" w:eastAsia="Times New Roman"/>
-          <w:sz w:val="20"/>
-        </w:rPr>
         <w:t xml:space="preserve"> </w:t>
       </w:r>
       <w:hyperlink r:id="rId12">
@@ -1365,12 +808,9 @@
     </w:p>
     <w:bookmarkEnd w:id="13"/>
     <w:sectPr>
-      <w:footerReference w:type="default" r:id="rId9"/>
       <w:footnotePr>
         <w:numRestart w:val="eachSect"/>
       </w:footnotePr>
-      <w:pgSz w:w="12240" w:h="15840"/>
-      <w:pgMar w:left="1440" w:right="1440" w:top="1440" w:bottom="1440"/>
     </w:sectPr>
   </w:body>
 </w:document>
@@ -1378,24 +818,6 @@
 
 <file path=word/comments.xml><?xml version="1.0" encoding="utf-8"?>
 <w:comments xmlns:w="http://schemas.openxmlformats.org/wordprocessingml/2006/main" xmlns:m="http://schemas.openxmlformats.org/officeDocument/2006/math" xmlns:r="http://schemas.openxmlformats.org/officeDocument/2006/relationships" xmlns:o="urn:schemas-microsoft-com:office:office" xmlns:v="urn:schemas-microsoft-com:vml" xmlns:w10="urn:schemas-microsoft-com:office:word" xmlns:a="http://schemas.openxmlformats.org/drawingml/2006/main" xmlns:pic="http://schemas.openxmlformats.org/drawingml/2006/picture" xmlns:wp="http://schemas.openxmlformats.org/drawingml/2006/wordprocessingDrawing"/>
-</file>
-
-<file path=word/footer1.xml><?xml version="1.0" encoding="utf-8"?>
-<w:ftr xmlns:m="http://schemas.openxmlformats.org/officeDocument/2006/math" xmlns:mc="http://schemas.openxmlformats.org/markup-compatibility/2006" xmlns:mo="http://schemas.microsoft.com/office/mac/office/2008/main" xmlns:mv="urn:schemas-microsoft-com:mac:vml" xmlns:o="urn:schemas-microsoft-com:office:office" xmlns:r="http://schemas.openxmlformats.org/officeDocument/2006/relationships" xmlns:v="urn:schemas-microsoft-com:vml" xmlns:w10="urn:schemas-microsoft-com:office:word" xmlns:w14="http://schemas.microsoft.com/office/word/2010/wordml" xmlns:w="http://schemas.openxmlformats.org/wordprocessingml/2006/main" xmlns:wne="http://schemas.microsoft.com/office/word/2006/wordml" xmlns:wp14="http://schemas.microsoft.com/office/word/2010/wordprocessingDrawing" xmlns:wp="http://schemas.openxmlformats.org/drawingml/2006/wordprocessingDrawing" xmlns:wpc="http://schemas.microsoft.com/office/word/2010/wordprocessingCanvas" xmlns:wpg="http://schemas.microsoft.com/office/word/2010/wordprocessingGroup" xmlns:wpi="http://schemas.microsoft.com/office/word/2010/wordprocessingInk" xmlns:wps="http://schemas.microsoft.com/office/word/2010/wordprocessingShape" mc:Ignorable="w14 wp14">
-  <w:p>
-    <w:pPr>
-      <w:pStyle w:val="Footer"/>
-      <w:jc w:val="center"/>
-    </w:pPr>
-    <w:r>
-      <w:rPr>
-        <w:rFonts w:ascii="Times New Roman" w:hAnsi="Times New Roman" w:cs="Times New Roman" w:eastAsia="Times New Roman"/>
-        <w:sz w:val="20"/>
-      </w:rPr>
-      <w:t>Sánchez Insfrán: Preprint submitted to Elsevier</w:t>
-    </w:r>
-  </w:p>
-</w:ftr>
 </file>
 
 <file path=word/footnotes.xml><?xml version="1.0" encoding="utf-8"?>
@@ -1631,13 +1053,6 @@
   <w:style w:default="1" w:styleId="Normal" w:type="paragraph">
     <w:name w:val="Normal"/>
     <w:qFormat/>
-    <w:pPr>
-      <w:spacing w:line="480" w:lineRule="auto"/>
-    </w:pPr>
-    <w:rPr>
-      <w:rFonts w:ascii="Times New Roman" w:hAnsi="Times New Roman"/>
-      <w:sz w:val="20"/>
-    </w:rPr>
   </w:style>
   <w:style w:styleId="BodyText" w:type="paragraph">
     <w:name w:val="Body Text"/>
@@ -1645,37 +1060,22 @@
     <w:link w:val="BodyTextChar"/>
     <w:qFormat/>
     <w:pPr>
-      <w:spacing w:after="180" w:before="180" w:line="480" w:lineRule="auto"/>
-    </w:pPr>
-    <w:rPr>
-      <w:rFonts w:ascii="Times New Roman" w:hAnsi="Times New Roman"/>
-      <w:sz w:val="20"/>
-    </w:rPr>
+      <w:spacing w:after="180" w:before="180"/>
+    </w:pPr>
   </w:style>
   <w:style w:customStyle="1" w:styleId="FirstParagraph" w:type="paragraph">
     <w:name w:val="First Paragraph"/>
     <w:basedOn w:val="BodyText"/>
     <w:next w:val="BodyText"/>
     <w:qFormat/>
-    <w:pPr>
-      <w:spacing w:line="480" w:lineRule="auto"/>
-    </w:pPr>
-    <w:rPr>
-      <w:rFonts w:ascii="Times New Roman" w:hAnsi="Times New Roman"/>
-      <w:sz w:val="20"/>
-    </w:rPr>
   </w:style>
   <w:style w:customStyle="1" w:styleId="Compact" w:type="paragraph">
     <w:name w:val="Compact"/>
     <w:basedOn w:val="BodyText"/>
     <w:qFormat/>
     <w:pPr>
-      <w:spacing w:after="36" w:before="36" w:line="480" w:lineRule="auto"/>
-    </w:pPr>
-    <w:rPr>
-      <w:rFonts w:ascii="Times New Roman" w:hAnsi="Times New Roman"/>
-      <w:sz w:val="20"/>
-    </w:rPr>
+      <w:spacing w:after="36" w:before="36"/>
+    </w:pPr>
   </w:style>
   <w:style w:styleId="Title" w:type="paragraph">
     <w:name w:val="Title"/>
@@ -1686,14 +1086,13 @@
     <w:qFormat/>
     <w:rsid w:val="00A10FD9"/>
     <w:pPr>
-      <w:spacing w:after="80" w:line="480" w:lineRule="auto"/>
+      <w:spacing w:after="80" w:line="240" w:lineRule="auto"/>
       <w:contextualSpacing/>
       <w:jc w:val="center"/>
     </w:pPr>
     <w:rPr>
-      <w:rFonts w:asciiTheme="majorHAnsi" w:cstheme="majorBidi" w:eastAsiaTheme="majorEastAsia" w:hAnsiTheme="majorHAnsi" w:ascii="Times New Roman" w:hAnsi="Times New Roman"/>
-      <w:b w:val="0"/>
-      <w:sz w:val="28"/>
+      <w:rFonts w:asciiTheme="majorHAnsi" w:cstheme="majorBidi" w:eastAsiaTheme="majorEastAsia" w:hAnsiTheme="majorHAnsi"/>
+      <w:sz w:val="56"/>
       <w:szCs w:val="56"/>
     </w:rPr>
   </w:style>
@@ -1751,11 +1150,9 @@
     <w:pPr>
       <w:keepNext/>
       <w:keepLines/>
-      <w:spacing w:line="480" w:lineRule="auto"/>
-    </w:pPr>
-    <w:rPr>
-      <w:rFonts w:ascii="Times New Roman" w:hAnsi="Times New Roman"/>
-      <w:sz w:val="20"/>
+    </w:pPr>
+    <w:rPr>
+      <w:sz w:val="24"/>
       <w:szCs w:val="24"/>
     </w:rPr>
   </w:style>
@@ -1767,11 +1164,9 @@
     <w:pPr>
       <w:keepNext/>
       <w:keepLines/>
-      <w:spacing w:line="480" w:lineRule="auto"/>
-    </w:pPr>
-    <w:rPr>
-      <w:rFonts w:ascii="Times New Roman" w:hAnsi="Times New Roman"/>
-      <w:sz w:val="20"/>
+    </w:pPr>
+    <w:rPr>
+      <w:sz w:val="24"/>
       <w:szCs w:val="24"/>
     </w:rPr>
   </w:style>
@@ -1826,14 +1221,13 @@
     <w:pPr>
       <w:keepNext/>
       <w:keepLines/>
-      <w:spacing w:after="80" w:before="360" w:line="480" w:lineRule="auto"/>
+      <w:spacing w:after="80" w:before="360"/>
       <w:outlineLvl w:val="0"/>
     </w:pPr>
     <w:rPr>
-      <w:rFonts w:asciiTheme="majorHAnsi" w:cstheme="majorBidi" w:eastAsiaTheme="majorEastAsia" w:hAnsiTheme="majorHAnsi" w:ascii="Times New Roman" w:hAnsi="Times New Roman"/>
-      <w:b w:val="0"/>
+      <w:rFonts w:asciiTheme="majorHAnsi" w:cstheme="majorBidi" w:eastAsiaTheme="majorEastAsia" w:hAnsiTheme="majorHAnsi"/>
       <w:color w:themeColor="accent1" w:themeShade="BF" w:val="0F4761"/>
-      <w:sz w:val="28"/>
+      <w:sz w:val="40"/>
       <w:szCs w:val="40"/>
     </w:rPr>
   </w:style>

</xml_diff>

<commit_message>
fix: completa el paquete de envío con figuras individuales
Añade Figure_1–Figure_5 y Figure_S1–Figure_S10 al submission, actualiza la carta al 29 de octubre y corrige la declaración de versión del código en el suplemento.
</commit_message>
<xml_diff>
--- a/entregables/cover_letter.docx
+++ b/entregables/cover_letter.docx
@@ -15,7 +15,7 @@
         <w:pStyle w:val="Date"/>
       </w:pPr>
       <w:r>
-        <w:t xml:space="preserve">2026-10-28</w:t>
+        <w:t xml:space="preserve">2026-10-29</w:t>
       </w:r>
     </w:p>
     <w:p>
@@ -33,7 +33,7 @@
         <w:t xml:space="preserve"> </w:t>
       </w:r>
       <w:r>
-        <w:t xml:space="preserve">October 28, 2026</w:t>
+        <w:t xml:space="preserve">October 29, 2026</w:t>
       </w:r>
     </w:p>
     <w:p>

</xml_diff>

<commit_message>
polish: suaviza el tono editorial del manuscrito y la carta
Sustituye formulaciones defensivas por afirmaciones directas sobre la contribución y la línea base, y elimina la mención redundante a Surgeon de la firma.
</commit_message>
<xml_diff>
--- a/entregables/cover_letter.docx
+++ b/entregables/cover_letter.docx
@@ -161,7 +161,7 @@
         <w:pStyle w:val="BodyText"/>
       </w:pPr>
       <w:r>
-        <w:t xml:space="preserve">The manuscript presents an auditable computational protocol and reproducible software infrastructure, rather than a regional machine-learning case study. Its central contribution is the formal D2 target operator, the gated M3/M2 inference policy and the open evaluation harness; the learner is deliberately replaceable.</w:t>
+        <w:t xml:space="preserve">The manuscript presents an auditable computational protocol and reproducible software infrastructure. Its central contribution is the formal D2 target operator, the gated M3/M2 inference policy and the open evaluation harness; the learner is deliberately replaceable.</w:t>
       </w:r>
     </w:p>
     <w:bookmarkStart w:id="9" w:name="motivation-and-core-scientific-novelty"/>
@@ -414,7 +414,7 @@
         <w:t xml:space="preserve"> </w:t>
       </w:r>
       <w:r>
-        <w:t xml:space="preserve">The framework enforces structural monotonic constraints within LightGBM (+1 for atmospheric dryness and wind pressure, −1 for antecedent rainfall and distance), mathematically preventing counterintuitive artifacts.</w:t>
+        <w:t xml:space="preserve">The framework enforces structural monotonic constraints within LightGBM (+1 for atmospheric dryness and wind pressure, −1 for antecedent rainfall and distance), constraining monotonic responses and reducing counterintuitive artifacts.</w:t>
       </w:r>
     </w:p>
     <w:p>
@@ -632,7 +632,7 @@
         <w:t xml:space="preserve"> </w:t>
       </w:r>
       <w:r>
-        <w:t xml:space="preserve">(Chaco) and population precision 9.67 %. The 2023 validation selected M3 for temporal nowcasting and M2 as the operational fallback; M1 was rejected as a fallback. These corrected metrics are the honest operational benchmark.</w:t>
+        <w:t xml:space="preserve">(Chaco) and population precision 9.67 %. The 2023 validation selected M3 for temporal nowcasting and M2 as the operational fallback; M1 was rejected as a fallback. These population-adjusted metrics define the operational benchmark.</w:t>
       </w:r>
     </w:p>
     <w:bookmarkEnd w:id="10"/>
@@ -736,13 +736,13 @@
           <w:b/>
           <w:bCs/>
         </w:rPr>
-        <w:t xml:space="preserve">Martín Sánchez Insfrán, MD</w:t>
+        <w:t xml:space="preserve">Martín Sánchez Insfrán</w:t>
       </w:r>
       <w:r>
         <w:br/>
       </w:r>
       <w:r>
-        <w:t xml:space="preserve">Independent Researcher / Surgeon</w:t>
+        <w:t xml:space="preserve">Independent Researcher</w:t>
       </w:r>
       <w:r>
         <w:br/>

</xml_diff>